<commit_message>
Signoff (CMS) case study; project dates; CI/CD and cloud on the CV; CV location, certifications and project bullets
Co-Authored-By: Claude Opus 5.5 <noreply@anthropic.com>
</commit_message>
<xml_diff>
--- a/public/Montaser-Ismail-CV.docx
+++ b/public/Montaser-Ismail-CV.docx
@@ -46,7 +46,7 @@
           <w:sz w:val="20"/>
           <w:szCs w:val="20"/>
         </w:rPr>
-        <w:t xml:space="preserve">Egypt</w:t>
+        <w:t xml:space="preserve">Sheikh Zayed City, Giza, Egypt</w:t>
       </w:r>
       <w:r>
         <w:rPr>
@@ -57,7 +57,7 @@
         </w:rPr>
         <w:t xml:space="preserve"> | </w:t>
       </w:r>
-      <w:hyperlink w:history="1" r:id="rIdqtuilksyizhq0udephjya">
+      <w:hyperlink w:history="1" r:id="rIdvalgutmigi4qm8ipes6mo">
         <w:r>
           <w:rPr>
             <w:rFonts w:ascii="Arial" w:cs="Arial" w:eastAsia="Arial" w:hAnsi="Arial"/>
@@ -77,7 +77,7 @@
         </w:rPr>
         <w:t xml:space="preserve"> | </w:t>
       </w:r>
-      <w:hyperlink w:history="1" r:id="rIdiavhol5yv5enqcfdo4ciu">
+      <w:hyperlink w:history="1" r:id="rIdiksjkybouaheemjbzt5su">
         <w:r>
           <w:rPr>
             <w:rFonts w:ascii="Arial" w:cs="Arial" w:eastAsia="Arial" w:hAnsi="Arial"/>
@@ -93,7 +93,7 @@
       <w:pPr>
         <w:jc w:val="center"/>
       </w:pPr>
-      <w:hyperlink w:history="1" r:id="rIds96yqhf-hpb0qzj879zek">
+      <w:hyperlink w:history="1" r:id="rIdidmzcocs-el_gdocxcch_">
         <w:r>
           <w:rPr>
             <w:rFonts w:ascii="Arial" w:cs="Arial" w:eastAsia="Arial" w:hAnsi="Arial"/>
@@ -113,7 +113,7 @@
         </w:rPr>
         <w:t xml:space="preserve"> | </w:t>
       </w:r>
-      <w:hyperlink w:history="1" r:id="rIdfxblszfq1zzmlcde60y5m">
+      <w:hyperlink w:history="1" r:id="rIdbnkua7jjxcamdxzygeap3">
         <w:r>
           <w:rPr>
             <w:rFonts w:ascii="Arial" w:cs="Arial" w:eastAsia="Arial" w:hAnsi="Arial"/>
@@ -133,7 +133,7 @@
         </w:rPr>
         <w:t xml:space="preserve"> | </w:t>
       </w:r>
-      <w:hyperlink w:history="1" r:id="rIdqcbtgtjd1wyexv55-flvc">
+      <w:hyperlink w:history="1" r:id="rIdy24kmj9vtgnxsygzbbrnb">
         <w:r>
           <w:rPr>
             <w:rFonts w:ascii="Arial" w:cs="Arial" w:eastAsia="Arial" w:hAnsi="Arial"/>
@@ -147,10 +147,11 @@
     </w:p>
     <w:p>
       <w:pPr>
+        <w:keepNext/>
         <w:pBdr>
           <w:bottom w:val="single" w:color="9AA1AD" w:sz="6" w:space="1"/>
         </w:pBdr>
-        <w:spacing w:after="80" w:before="180"/>
+        <w:spacing w:after="80" w:before="120"/>
       </w:pPr>
       <w:r>
         <w:rPr>
@@ -169,18 +170,19 @@
         <w:rPr>
           <w:rFonts w:ascii="Arial" w:cs="Arial" w:eastAsia="Arial" w:hAnsi="Arial"/>
           <w:color w:val="111318"/>
-          <w:sz w:val="21"/>
-          <w:szCs w:val="21"/>
-        </w:rPr>
-        <w:t xml:space="preserve">Full-stack software engineer with 2+ years building enterprise web platforms. Specialised in metadata-driven React interfaces and Node.js/NestJS services backed by MongoDB aggregations. Ships tests with every feature: 1,200+ automated tests and 300+ API endpoints across four team-built platforms.</w:t>
-      </w:r>
-    </w:p>
-    <w:p>
-      <w:pPr>
+          <w:sz w:val="20"/>
+          <w:szCs w:val="20"/>
+        </w:rPr>
+        <w:t xml:space="preserve">Full-stack software engineer with 2+ years building enterprise platforms: metadata-driven React interfaces and Node.js/NestJS APIs. Shipped 1,200+ automated tests and 300+ API endpoints across four team-built products.</w:t>
+      </w:r>
+    </w:p>
+    <w:p>
+      <w:pPr>
+        <w:keepNext/>
         <w:pBdr>
           <w:bottom w:val="single" w:color="9AA1AD" w:sz="6" w:space="1"/>
         </w:pBdr>
-        <w:spacing w:after="80" w:before="180"/>
+        <w:spacing w:after="80" w:before="120"/>
       </w:pPr>
       <w:r>
         <w:rPr>
@@ -201,8 +203,8 @@
           <w:b/>
           <w:bCs/>
           <w:color w:val="111318"/>
-          <w:sz w:val="21"/>
-          <w:szCs w:val="21"/>
+          <w:sz w:val="20"/>
+          <w:szCs w:val="20"/>
         </w:rPr>
         <w:t xml:space="preserve">Frontend: </w:t>
       </w:r>
@@ -210,8 +212,8 @@
         <w:rPr>
           <w:rFonts w:ascii="Arial" w:cs="Arial" w:eastAsia="Arial" w:hAnsi="Arial"/>
           <w:color w:val="111318"/>
-          <w:sz w:val="21"/>
-          <w:szCs w:val="21"/>
+          <w:sz w:val="20"/>
+          <w:szCs w:val="20"/>
         </w:rPr>
         <w:t xml:space="preserve">React, Next.js, Angular, TypeScript, Redux Toolkit, Tailwind CSS, Framer Motion</w:t>
       </w:r>
@@ -223,8 +225,8 @@
           <w:b/>
           <w:bCs/>
           <w:color w:val="111318"/>
-          <w:sz w:val="21"/>
-          <w:szCs w:val="21"/>
+          <w:sz w:val="20"/>
+          <w:szCs w:val="20"/>
         </w:rPr>
         <w:t xml:space="preserve">Backend: </w:t>
       </w:r>
@@ -232,8 +234,8 @@
         <w:rPr>
           <w:rFonts w:ascii="Arial" w:cs="Arial" w:eastAsia="Arial" w:hAnsi="Arial"/>
           <w:color w:val="111318"/>
-          <w:sz w:val="21"/>
-          <w:szCs w:val="21"/>
+          <w:sz w:val="20"/>
+          <w:szCs w:val="20"/>
         </w:rPr>
         <w:t xml:space="preserve">Node.js, NestJS, Express, GraphQL, Socket.io, Redis, BullMQ, JWT Auth</w:t>
       </w:r>
@@ -245,8 +247,8 @@
           <w:b/>
           <w:bCs/>
           <w:color w:val="111318"/>
-          <w:sz w:val="21"/>
-          <w:szCs w:val="21"/>
+          <w:sz w:val="20"/>
+          <w:szCs w:val="20"/>
         </w:rPr>
         <w:t xml:space="preserve">Data: </w:t>
       </w:r>
@@ -254,8 +256,8 @@
         <w:rPr>
           <w:rFonts w:ascii="Arial" w:cs="Arial" w:eastAsia="Arial" w:hAnsi="Arial"/>
           <w:color w:val="111318"/>
-          <w:sz w:val="21"/>
-          <w:szCs w:val="21"/>
+          <w:sz w:val="20"/>
+          <w:szCs w:val="20"/>
         </w:rPr>
         <w:t xml:space="preserve">MongoDB, PostgreSQL, Prisma, MySQL, SQL Server, AWS S3</w:t>
       </w:r>
@@ -267,8 +269,8 @@
           <w:b/>
           <w:bCs/>
           <w:color w:val="111318"/>
-          <w:sz w:val="21"/>
-          <w:szCs w:val="21"/>
+          <w:sz w:val="20"/>
+          <w:szCs w:val="20"/>
         </w:rPr>
         <w:t xml:space="preserve">Testing &amp; DevOps: </w:t>
       </w:r>
@@ -276,21 +278,21 @@
         <w:rPr>
           <w:rFonts w:ascii="Arial" w:cs="Arial" w:eastAsia="Arial" w:hAnsi="Arial"/>
           <w:color w:val="111318"/>
-          <w:sz w:val="21"/>
-          <w:szCs w:val="21"/>
-        </w:rPr>
-        <w:t xml:space="preserve">Jest, Vitest, Jasmine, Docker, Nx Monorepos, CI/CD</w:t>
-      </w:r>
-    </w:p>
-    <w:p>
-      <w:r>
-        <w:rPr>
-          <w:rFonts w:ascii="Arial" w:cs="Arial" w:eastAsia="Arial" w:hAnsi="Arial"/>
-          <w:b/>
-          <w:bCs/>
-          <w:color w:val="111318"/>
-          <w:sz w:val="21"/>
-          <w:szCs w:val="21"/>
+          <w:sz w:val="20"/>
+          <w:szCs w:val="20"/>
+        </w:rPr>
+        <w:t xml:space="preserve">Jest, Vitest, Jasmine, Docker, Nx Monorepos, GitHub Actions, CI/CD</w:t>
+      </w:r>
+    </w:p>
+    <w:p>
+      <w:r>
+        <w:rPr>
+          <w:rFonts w:ascii="Arial" w:cs="Arial" w:eastAsia="Arial" w:hAnsi="Arial"/>
+          <w:b/>
+          <w:bCs/>
+          <w:color w:val="111318"/>
+          <w:sz w:val="20"/>
+          <w:szCs w:val="20"/>
         </w:rPr>
         <w:t xml:space="preserve">Languages: </w:t>
       </w:r>
@@ -298,8 +300,8 @@
         <w:rPr>
           <w:rFonts w:ascii="Arial" w:cs="Arial" w:eastAsia="Arial" w:hAnsi="Arial"/>
           <w:color w:val="111318"/>
-          <w:sz w:val="21"/>
-          <w:szCs w:val="21"/>
+          <w:sz w:val="20"/>
+          <w:szCs w:val="20"/>
         </w:rPr>
         <w:t xml:space="preserve">JavaScript, TypeScript, HTML, CSS, SASS, SQL, Python, C</w:t>
       </w:r>
@@ -311,8 +313,30 @@
           <w:b/>
           <w:bCs/>
           <w:color w:val="111318"/>
-          <w:sz w:val="21"/>
-          <w:szCs w:val="21"/>
+          <w:sz w:val="20"/>
+          <w:szCs w:val="20"/>
+        </w:rPr>
+        <w:t xml:space="preserve">Cloud: </w:t>
+      </w:r>
+      <w:r>
+        <w:rPr>
+          <w:rFonts w:ascii="Arial" w:cs="Arial" w:eastAsia="Arial" w:hAnsi="Arial"/>
+          <w:color w:val="111318"/>
+          <w:sz w:val="20"/>
+          <w:szCs w:val="20"/>
+        </w:rPr>
+        <w:t xml:space="preserve">Vercel, Render, Heroku, Neon PostgreSQL, Upstash Redis, Cloudflare R2</w:t>
+      </w:r>
+    </w:p>
+    <w:p>
+      <w:r>
+        <w:rPr>
+          <w:rFonts w:ascii="Arial" w:cs="Arial" w:eastAsia="Arial" w:hAnsi="Arial"/>
+          <w:b/>
+          <w:bCs/>
+          <w:color w:val="111318"/>
+          <w:sz w:val="20"/>
+          <w:szCs w:val="20"/>
         </w:rPr>
         <w:t xml:space="preserve">Practices: </w:t>
       </w:r>
@@ -320,18 +344,19 @@
         <w:rPr>
           <w:rFonts w:ascii="Arial" w:cs="Arial" w:eastAsia="Arial" w:hAnsi="Arial"/>
           <w:color w:val="111318"/>
-          <w:sz w:val="21"/>
-          <w:szCs w:val="21"/>
+          <w:sz w:val="20"/>
+          <w:szCs w:val="20"/>
         </w:rPr>
         <w:t xml:space="preserve">OOP, SOLID, Design patterns, REST and GraphQL API design, Git, Linux</w:t>
       </w:r>
     </w:p>
     <w:p>
       <w:pPr>
+        <w:keepNext/>
         <w:pBdr>
           <w:bottom w:val="single" w:color="9AA1AD" w:sz="6" w:space="1"/>
         </w:pBdr>
-        <w:spacing w:after="80" w:before="180"/>
+        <w:spacing w:after="80" w:before="120"/>
       </w:pPr>
       <w:r>
         <w:rPr>
@@ -370,8 +395,8 @@
         <w:rPr>
           <w:rFonts w:ascii="Arial" w:cs="Arial" w:eastAsia="Arial" w:hAnsi="Arial"/>
           <w:color w:val="3F4552"/>
-          <w:sz w:val="21"/>
-          <w:szCs w:val="21"/>
+          <w:sz w:val="20"/>
+          <w:szCs w:val="20"/>
         </w:rPr>
         <w:t xml:space="preserve">Arkaan International Group Co. | Dec 2025 - Present</w:t>
       </w:r>
@@ -388,8 +413,8 @@
         <w:rPr>
           <w:rFonts w:ascii="Arial" w:cs="Arial" w:eastAsia="Arial" w:hAnsi="Arial"/>
           <w:color w:val="111318"/>
-          <w:sz w:val="21"/>
-          <w:szCs w:val="21"/>
+          <w:sz w:val="20"/>
+          <w:szCs w:val="20"/>
         </w:rPr>
         <w:t xml:space="preserve">Engineered dynamic UI components rendered entirely from JSON metadata schemas, reducing manual frontend coding effort by ~40%.</w:t>
       </w:r>
@@ -406,8 +431,8 @@
         <w:rPr>
           <w:rFonts w:ascii="Arial" w:cs="Arial" w:eastAsia="Arial" w:hAnsi="Arial"/>
           <w:color w:val="111318"/>
-          <w:sz w:val="21"/>
-          <w:szCs w:val="21"/>
+          <w:sz w:val="20"/>
+          <w:szCs w:val="20"/>
         </w:rPr>
         <w:t xml:space="preserve">Developed configurable form builders that auto-generate layouts from backend data models, cutting form development time by ~70% across 5+ form types.</w:t>
       </w:r>
@@ -424,41 +449,10 @@
         <w:rPr>
           <w:rFonts w:ascii="Arial" w:cs="Arial" w:eastAsia="Arial" w:hAnsi="Arial"/>
           <w:color w:val="111318"/>
-          <w:sz w:val="21"/>
-          <w:szCs w:val="21"/>
+          <w:sz w:val="20"/>
+          <w:szCs w:val="20"/>
         </w:rPr>
         <w:t xml:space="preserve">Built a high-performance rendering engine mapping server-side metadata to reusable React components, supporting 10+ reusable component types application-wide.</w:t>
-      </w:r>
-    </w:p>
-    <w:p>
-      <w:pPr>
-        <w:keepNext/>
-        <w:spacing w:before="100"/>
-      </w:pPr>
-      <w:r>
-        <w:rPr>
-          <w:rFonts w:ascii="Arial" w:cs="Arial" w:eastAsia="Arial" w:hAnsi="Arial"/>
-          <w:b/>
-          <w:bCs/>
-          <w:color w:val="111318"/>
-          <w:sz w:val="22"/>
-          <w:szCs w:val="22"/>
-        </w:rPr>
-        <w:t xml:space="preserve">Backend Developer</w:t>
-      </w:r>
-    </w:p>
-    <w:p>
-      <w:pPr>
-        <w:keepNext/>
-      </w:pPr>
-      <w:r>
-        <w:rPr>
-          <w:rFonts w:ascii="Arial" w:cs="Arial" w:eastAsia="Arial" w:hAnsi="Arial"/>
-          <w:color w:val="3F4552"/>
-          <w:sz w:val="21"/>
-          <w:szCs w:val="21"/>
-        </w:rPr>
-        <w:t xml:space="preserve">Qyser Tech. | Sep 2024 - Mar 2026</w:t>
       </w:r>
     </w:p>
     <w:p>
@@ -473,10 +467,41 @@
         <w:rPr>
           <w:rFonts w:ascii="Arial" w:cs="Arial" w:eastAsia="Arial" w:hAnsi="Arial"/>
           <w:color w:val="111318"/>
-          <w:sz w:val="21"/>
-          <w:szCs w:val="21"/>
-        </w:rPr>
-        <w:t xml:space="preserve">Architected modular backend services with Node.js and REST APIs, serving 500+ concurrent API requests.</w:t>
+          <w:sz w:val="20"/>
+          <w:szCs w:val="20"/>
+        </w:rPr>
+        <w:t xml:space="preserve">Led the front end of a client procurement platform: designed the interface in Figma and shipped it with 566 Vitest tests across 49 files.</w:t>
+      </w:r>
+    </w:p>
+    <w:p>
+      <w:pPr>
+        <w:keepNext/>
+        <w:spacing w:before="70"/>
+      </w:pPr>
+      <w:r>
+        <w:rPr>
+          <w:rFonts w:ascii="Arial" w:cs="Arial" w:eastAsia="Arial" w:hAnsi="Arial"/>
+          <w:b/>
+          <w:bCs/>
+          <w:color w:val="111318"/>
+          <w:sz w:val="22"/>
+          <w:szCs w:val="22"/>
+        </w:rPr>
+        <w:t xml:space="preserve">Backend Developer</w:t>
+      </w:r>
+    </w:p>
+    <w:p>
+      <w:pPr>
+        <w:keepNext/>
+      </w:pPr>
+      <w:r>
+        <w:rPr>
+          <w:rFonts w:ascii="Arial" w:cs="Arial" w:eastAsia="Arial" w:hAnsi="Arial"/>
+          <w:color w:val="3F4552"/>
+          <w:sz w:val="20"/>
+          <w:szCs w:val="20"/>
+        </w:rPr>
+        <w:t xml:space="preserve">Qyser Tech. | Sep 2024 - Mar 2026</w:t>
       </w:r>
     </w:p>
     <w:p>
@@ -491,10 +516,10 @@
         <w:rPr>
           <w:rFonts w:ascii="Arial" w:cs="Arial" w:eastAsia="Arial" w:hAnsi="Arial"/>
           <w:color w:val="111318"/>
-          <w:sz w:val="21"/>
-          <w:szCs w:val="21"/>
-        </w:rPr>
-        <w:t xml:space="preserve">Built dynamic report generation features with complex queries and aggregations, processing across 100K+ records.</w:t>
+          <w:sz w:val="20"/>
+          <w:szCs w:val="20"/>
+        </w:rPr>
+        <w:t xml:space="preserve">Architected modular backend services with Node.js and REST APIs, serving 500+ concurrent API requests.</w:t>
       </w:r>
     </w:p>
     <w:p>
@@ -509,18 +534,37 @@
         <w:rPr>
           <w:rFonts w:ascii="Arial" w:cs="Arial" w:eastAsia="Arial" w:hAnsi="Arial"/>
           <w:color w:val="111318"/>
-          <w:sz w:val="21"/>
-          <w:szCs w:val="21"/>
+          <w:sz w:val="20"/>
+          <w:szCs w:val="20"/>
+        </w:rPr>
+        <w:t xml:space="preserve">Built dynamic report generation features with complex queries and aggregations, processing across 100K+ records.</w:t>
+      </w:r>
+    </w:p>
+    <w:p>
+      <w:pPr>
+        <w:pStyle w:val="ListParagraph"/>
+        <w:numPr>
+          <w:ilvl w:val="0"/>
+          <w:numId w:val="1"/>
+        </w:numPr>
+      </w:pPr>
+      <w:r>
+        <w:rPr>
+          <w:rFonts w:ascii="Arial" w:cs="Arial" w:eastAsia="Arial" w:hAnsi="Arial"/>
+          <w:color w:val="111318"/>
+          <w:sz w:val="20"/>
+          <w:szCs w:val="20"/>
         </w:rPr>
         <w:t xml:space="preserve">Delivered the "Performance" feature using MongoDB aggregations to generate employee insights and support admin approvals, cutting manual HR reporting time by ~60%.</w:t>
       </w:r>
     </w:p>
     <w:p>
       <w:pPr>
+        <w:keepNext/>
         <w:pBdr>
           <w:bottom w:val="single" w:color="9AA1AD" w:sz="6" w:space="1"/>
         </w:pBdr>
-        <w:spacing w:after="80" w:before="180"/>
+        <w:spacing w:after="80" w:before="120"/>
       </w:pPr>
       <w:r>
         <w:rPr>
@@ -548,7 +592,7 @@
           <w:sz w:val="22"/>
           <w:szCs w:val="22"/>
         </w:rPr>
-        <w:t xml:space="preserve">SmartShift</w:t>
+        <w:t xml:space="preserve">SmartShift: a shift-scheduling platform for hospitals.</w:t>
       </w:r>
     </w:p>
     <w:p>
@@ -559,27 +603,63 @@
         <w:rPr>
           <w:rFonts w:ascii="Arial" w:cs="Arial" w:eastAsia="Arial" w:hAnsi="Arial"/>
           <w:color w:val="3F4552"/>
-          <w:sz w:val="21"/>
-          <w:szCs w:val="21"/>
-        </w:rPr>
-        <w:t xml:space="preserve">Full-stack engineer, API lead | Team project, 2025</w:t>
-      </w:r>
-    </w:p>
-    <w:p>
-      <w:r>
-        <w:rPr>
-          <w:rFonts w:ascii="Arial" w:cs="Arial" w:eastAsia="Arial" w:hAnsi="Arial"/>
-          <w:color w:val="111318"/>
-          <w:sz w:val="21"/>
-          <w:szCs w:val="21"/>
-        </w:rPr>
-        <w:t xml:space="preserve">A shift-scheduling platform for hospitals. 76 / 102 API commits are mine; 3 apps: API, React, Angular. Technologies: Node.js, Express, MongoDB, React, Redux Toolkit, Angular, Nx, Docker.</w:t>
+          <w:sz w:val="20"/>
+          <w:szCs w:val="20"/>
+        </w:rPr>
+        <w:t xml:space="preserve">Full-stack engineer, API lead | Team project | Oct 2025 - Nov 2025</w:t>
+      </w:r>
+    </w:p>
+    <w:p>
+      <w:pPr>
+        <w:pStyle w:val="ListParagraph"/>
+        <w:numPr>
+          <w:ilvl w:val="0"/>
+          <w:numId w:val="1"/>
+        </w:numPr>
+      </w:pPr>
+      <w:r>
+        <w:rPr>
+          <w:rFonts w:ascii="Arial" w:cs="Arial" w:eastAsia="Arial" w:hAnsi="Arial"/>
+          <w:color w:val="111318"/>
+          <w:sz w:val="20"/>
+          <w:szCs w:val="20"/>
+        </w:rPr>
+        <w:t xml:space="preserve">Built the GitHub Actions CI/CD: Nx lint, test and build on each push; Docker image deployed to Heroku.</w:t>
+      </w:r>
+    </w:p>
+    <w:p>
+      <w:pPr>
+        <w:pStyle w:val="ListParagraph"/>
+        <w:numPr>
+          <w:ilvl w:val="0"/>
+          <w:numId w:val="1"/>
+        </w:numPr>
+      </w:pPr>
+      <w:r>
+        <w:rPr>
+          <w:rFonts w:ascii="Arial" w:cs="Arial" w:eastAsia="Arial" w:hAnsi="Arial"/>
+          <w:color w:val="111318"/>
+          <w:sz w:val="20"/>
+          <w:szCs w:val="20"/>
+        </w:rPr>
+        <w:t xml:space="preserve">76 / 102 API commits are mine; 3 apps: API, React, Angular.</w:t>
+      </w:r>
+    </w:p>
+    <w:p>
+      <w:r>
+        <w:rPr>
+          <w:rFonts w:ascii="Arial" w:cs="Arial" w:eastAsia="Arial" w:hAnsi="Arial"/>
+          <w:color w:val="111318"/>
+          <w:sz w:val="20"/>
+          <w:szCs w:val="20"/>
+        </w:rPr>
+        <w:t xml:space="preserve">Technologies: Node.js, Express, MongoDB, React, Redux Toolkit, Angular, Nx, Docker.</w:t>
       </w:r>
     </w:p>
     <w:p>
       <w:pPr>
         <w:keepNext/>
-        <w:spacing w:before="100"/>
+        <w:spacing w:before="70"/>
       </w:pPr>
       <w:r>
         <w:rPr>
@@ -590,7 +670,7 @@
           <w:sz w:val="22"/>
           <w:szCs w:val="22"/>
         </w:rPr>
-        <w:t xml:space="preserve">Tenders - Procurement Platform</w:t>
+        <w:t xml:space="preserve">Signoff - Content Management System: a content platform for editorial teams.</w:t>
       </w:r>
     </w:p>
     <w:p>
@@ -601,27 +681,63 @@
         <w:rPr>
           <w:rFonts w:ascii="Arial" w:cs="Arial" w:eastAsia="Arial" w:hAnsi="Arial"/>
           <w:color w:val="3F4552"/>
-          <w:sz w:val="21"/>
-          <w:szCs w:val="21"/>
-        </w:rPr>
-        <w:t xml:space="preserve">Lead front-end developer, UI designer | Arkaan International, client project</w:t>
-      </w:r>
-    </w:p>
-    <w:p>
-      <w:r>
-        <w:rPr>
-          <w:rFonts w:ascii="Arial" w:cs="Arial" w:eastAsia="Arial" w:hAnsi="Arial"/>
-          <w:color w:val="111318"/>
-          <w:sz w:val="21"/>
-          <w:szCs w:val="21"/>
-        </w:rPr>
-        <w:t xml:space="preserve">A tendering and procurement system. 566 tests passing; 49 test files. Technologies: React, Redux Toolkit, Tailwind CSS, Vite, Vitest.</w:t>
+          <w:sz w:val="20"/>
+          <w:szCs w:val="20"/>
+        </w:rPr>
+        <w:t xml:space="preserve">Full-stack engineer | Own product, live | Sep 2026 - Present</w:t>
+      </w:r>
+    </w:p>
+    <w:p>
+      <w:pPr>
+        <w:pStyle w:val="ListParagraph"/>
+        <w:numPr>
+          <w:ilvl w:val="0"/>
+          <w:numId w:val="1"/>
+        </w:numPr>
+      </w:pPr>
+      <w:r>
+        <w:rPr>
+          <w:rFonts w:ascii="Arial" w:cs="Arial" w:eastAsia="Arial" w:hAnsi="Arial"/>
+          <w:color w:val="111318"/>
+          <w:sz w:val="20"/>
+          <w:szCs w:val="20"/>
+        </w:rPr>
+        <w:t xml:space="preserve">Runs on Vercel and Render with Neon PostgreSQL, Upstash Redis and Cloudflare R2; GitHub Actions CI runs lint and tests.</w:t>
+      </w:r>
+    </w:p>
+    <w:p>
+      <w:pPr>
+        <w:pStyle w:val="ListParagraph"/>
+        <w:numPr>
+          <w:ilvl w:val="0"/>
+          <w:numId w:val="1"/>
+        </w:numPr>
+      </w:pPr>
+      <w:r>
+        <w:rPr>
+          <w:rFonts w:ascii="Arial" w:cs="Arial" w:eastAsia="Arial" w:hAnsi="Arial"/>
+          <w:color w:val="111318"/>
+          <w:sz w:val="20"/>
+          <w:szCs w:val="20"/>
+        </w:rPr>
+        <w:t xml:space="preserve">104 unit tests passing; 20 end-to-end tests.</w:t>
+      </w:r>
+    </w:p>
+    <w:p>
+      <w:r>
+        <w:rPr>
+          <w:rFonts w:ascii="Arial" w:cs="Arial" w:eastAsia="Arial" w:hAnsi="Arial"/>
+          <w:color w:val="111318"/>
+          <w:sz w:val="20"/>
+          <w:szCs w:val="20"/>
+        </w:rPr>
+        <w:t xml:space="preserve">Technologies: NestJS, TypeScript, PostgreSQL, Prisma, Redis, BullMQ, Next.js, Docker.</w:t>
       </w:r>
     </w:p>
     <w:p>
       <w:pPr>
         <w:keepNext/>
-        <w:spacing w:before="100"/>
+        <w:spacing w:before="70"/>
       </w:pPr>
       <w:r>
         <w:rPr>
@@ -632,7 +748,7 @@
           <w:sz w:val="22"/>
           <w:szCs w:val="22"/>
         </w:rPr>
-        <w:t xml:space="preserve">Trigo - Ride-Hailing Backend</w:t>
+        <w:t xml:space="preserve">Trigo - Ride-Hailing Backend: the real-time API behind a ride-hailing app.</w:t>
       </w:r>
     </w:p>
     <w:p>
@@ -643,29 +759,66 @@
         <w:rPr>
           <w:rFonts w:ascii="Arial" w:cs="Arial" w:eastAsia="Arial" w:hAnsi="Arial"/>
           <w:color w:val="3F4552"/>
-          <w:sz w:val="21"/>
-          <w:szCs w:val="21"/>
-        </w:rPr>
-        <w:t xml:space="preserve">Backend developer | Delivery Quote Ltd, team project</w:t>
-      </w:r>
-    </w:p>
-    <w:p>
-      <w:r>
-        <w:rPr>
-          <w:rFonts w:ascii="Arial" w:cs="Arial" w:eastAsia="Arial" w:hAnsi="Arial"/>
-          <w:color w:val="111318"/>
-          <w:sz w:val="21"/>
-          <w:szCs w:val="21"/>
-        </w:rPr>
-        <w:t xml:space="preserve">The real-time API behind a ride-hailing app. 639 unit tests; 136 documented endpoints; 17 / 24 commits are mine. Technologies: NestJS, TypeScript, PostgreSQL, Prisma, Redis, Socket.io, Jest.</w:t>
-      </w:r>
-    </w:p>
-    <w:p>
-      <w:pPr>
+          <w:sz w:val="20"/>
+          <w:szCs w:val="20"/>
+        </w:rPr>
+        <w:t xml:space="preserve">Backend developer | Delivery Quote Ltd, team project | Dec 2025 - Feb 2026</w:t>
+      </w:r>
+    </w:p>
+    <w:p>
+      <w:pPr>
+        <w:pStyle w:val="ListParagraph"/>
+        <w:numPr>
+          <w:ilvl w:val="0"/>
+          <w:numId w:val="1"/>
+        </w:numPr>
+      </w:pPr>
+      <w:r>
+        <w:rPr>
+          <w:rFonts w:ascii="Arial" w:cs="Arial" w:eastAsia="Arial" w:hAnsi="Arial"/>
+          <w:color w:val="111318"/>
+          <w:sz w:val="20"/>
+          <w:szCs w:val="20"/>
+        </w:rPr>
+        <w:t xml:space="preserve">Live locations, chat and call signaling over Socket.io, scaled across instances with a Redis adapter.</w:t>
+      </w:r>
+    </w:p>
+    <w:p>
+      <w:pPr>
+        <w:pStyle w:val="ListParagraph"/>
+        <w:numPr>
+          <w:ilvl w:val="0"/>
+          <w:numId w:val="1"/>
+        </w:numPr>
+      </w:pPr>
+      <w:r>
+        <w:rPr>
+          <w:rFonts w:ascii="Arial" w:cs="Arial" w:eastAsia="Arial" w:hAnsi="Arial"/>
+          <w:color w:val="111318"/>
+          <w:sz w:val="20"/>
+          <w:szCs w:val="20"/>
+        </w:rPr>
+        <w:t xml:space="preserve">639 unit tests; 136 documented endpoints; 17 / 24 commits are mine.</w:t>
+      </w:r>
+    </w:p>
+    <w:p>
+      <w:r>
+        <w:rPr>
+          <w:rFonts w:ascii="Arial" w:cs="Arial" w:eastAsia="Arial" w:hAnsi="Arial"/>
+          <w:color w:val="111318"/>
+          <w:sz w:val="20"/>
+          <w:szCs w:val="20"/>
+        </w:rPr>
+        <w:t xml:space="preserve">Technologies: NestJS, TypeScript, PostgreSQL, Prisma, Redis, Socket.io, Jest.</w:t>
+      </w:r>
+    </w:p>
+    <w:p>
+      <w:pPr>
+        <w:keepNext/>
         <w:pBdr>
           <w:bottom w:val="single" w:color="9AA1AD" w:sz="6" w:space="1"/>
         </w:pBdr>
-        <w:spacing w:after="80" w:before="180"/>
+        <w:spacing w:after="80" w:before="120"/>
       </w:pPr>
       <w:r>
         <w:rPr>
@@ -681,7 +834,51 @@
     </w:p>
     <w:p>
       <w:pPr>
+        <w:spacing w:before="0"/>
+      </w:pPr>
+      <w:r>
+        <w:rPr>
+          <w:rFonts w:ascii="Arial" w:cs="Arial" w:eastAsia="Arial" w:hAnsi="Arial"/>
+          <w:b/>
+          <w:bCs/>
+          <w:color w:val="111318"/>
+          <w:sz w:val="20"/>
+          <w:szCs w:val="20"/>
+        </w:rPr>
+        <w:t xml:space="preserve">B.Sc. Communication &amp; Electronics Engineering</w:t>
+      </w:r>
+      <w:r>
+        <w:rPr>
+          <w:rFonts w:ascii="Arial" w:cs="Arial" w:eastAsia="Arial" w:hAnsi="Arial"/>
+          <w:color w:val="3F4552"/>
+          <w:sz w:val="20"/>
+          <w:szCs w:val="20"/>
+        </w:rPr>
+        <w:t xml:space="preserve"> | 6 October High Institute for Engineering &amp; Technology | 2014 - 2019</w:t>
+      </w:r>
+    </w:p>
+    <w:p>
+      <w:pPr>
         <w:keepNext/>
+        <w:pBdr>
+          <w:bottom w:val="single" w:color="9AA1AD" w:sz="6" w:space="1"/>
+        </w:pBdr>
+        <w:spacing w:after="80" w:before="120"/>
+      </w:pPr>
+      <w:r>
+        <w:rPr>
+          <w:rFonts w:ascii="Arial" w:cs="Arial" w:eastAsia="Arial" w:hAnsi="Arial"/>
+          <w:b/>
+          <w:bCs/>
+          <w:color w:val="111318"/>
+          <w:sz w:val="24"/>
+          <w:szCs w:val="24"/>
+        </w:rPr>
+        <w:t xml:space="preserve">CERTIFICATIONS</w:t>
+      </w:r>
+    </w:p>
+    <w:p>
+      <w:pPr>
         <w:spacing w:before="0"/>
       </w:pPr>
       <w:r>
@@ -690,71 +887,24 @@
           <w:b/>
           <w:bCs/>
           <w:color w:val="111318"/>
-          <w:sz w:val="22"/>
-          <w:szCs w:val="22"/>
+          <w:sz w:val="20"/>
+          <w:szCs w:val="20"/>
         </w:rPr>
         <w:t xml:space="preserve">Full Stack Intensive Code Camp - MEARN Stack</w:t>
       </w:r>
-    </w:p>
-    <w:p>
-      <w:pPr>
-        <w:keepNext/>
-      </w:pPr>
       <w:r>
         <w:rPr>
           <w:rFonts w:ascii="Arial" w:cs="Arial" w:eastAsia="Arial" w:hAnsi="Arial"/>
           <w:color w:val="3F4552"/>
-          <w:sz w:val="21"/>
-          <w:szCs w:val="21"/>
-        </w:rPr>
-        <w:t xml:space="preserve">Information Technology Institute (ITI) | Jul 2025 - Dec 2025</w:t>
-      </w:r>
-    </w:p>
-    <w:p>
-      <w:pPr>
-        <w:keepNext/>
-        <w:spacing w:before="100"/>
-      </w:pPr>
-      <w:r>
-        <w:rPr>
-          <w:rFonts w:ascii="Arial" w:cs="Arial" w:eastAsia="Arial" w:hAnsi="Arial"/>
-          <w:b/>
-          <w:bCs/>
-          <w:color w:val="111318"/>
-          <w:sz w:val="22"/>
-          <w:szCs w:val="22"/>
-        </w:rPr>
-        <w:t xml:space="preserve">B.Sc. Communication &amp; Electronics Engineering</w:t>
-      </w:r>
-    </w:p>
-    <w:p>
-      <w:pPr>
-        <w:keepNext/>
-      </w:pPr>
-      <w:r>
-        <w:rPr>
-          <w:rFonts w:ascii="Arial" w:cs="Arial" w:eastAsia="Arial" w:hAnsi="Arial"/>
-          <w:color w:val="3F4552"/>
-          <w:sz w:val="21"/>
-          <w:szCs w:val="21"/>
-        </w:rPr>
-        <w:t xml:space="preserve">6 October High Institute for Engineering &amp; Technology | 2014 - 2019</w:t>
-      </w:r>
-    </w:p>
-    <w:p>
-      <w:r>
-        <w:rPr>
-          <w:rFonts w:ascii="Arial" w:cs="Arial" w:eastAsia="Arial" w:hAnsi="Arial"/>
-          <w:color w:val="111318"/>
-          <w:sz w:val="21"/>
-          <w:szCs w:val="21"/>
-        </w:rPr>
-        <w:t xml:space="preserve">RF energy-harvesting rectenna design (Agilent ADS, CST); organized IEEE student workshops.</w:t>
+          <w:sz w:val="20"/>
+          <w:szCs w:val="20"/>
+        </w:rPr>
+        <w:t xml:space="preserve"> | Information Technology Institute (ITI) | Jul 2025 - Dec 2025</w:t>
       </w:r>
     </w:p>
     <w:sectPr>
       <w:pgSz w:w="11905" w:h="16837" w:orient="portrait"/>
-      <w:pgMar w:top="623" w:right="850" w:bottom="623" w:left="850" w:header="708" w:footer="708" w:gutter="0"/>
+      <w:pgMar w:top="566" w:right="850" w:bottom="566" w:left="850" w:header="708" w:footer="708" w:gutter="0"/>
       <w:pgNumType/>
       <w:docGrid w:linePitch="360"/>
     </w:sectPr>

</xml_diff>

<commit_message>
CV: drop the cloud skills line, add OAuth 2.0 and Material UI, project titles with a plain description, consistent education entries
Co-Authored-By: Claude Opus 5.5 <noreply@anthropic.com>
</commit_message>
<xml_diff>
--- a/public/Montaser-Ismail-CV.docx
+++ b/public/Montaser-Ismail-CV.docx
@@ -57,7 +57,7 @@
         </w:rPr>
         <w:t xml:space="preserve"> | </w:t>
       </w:r>
-      <w:hyperlink w:history="1" r:id="rIdvalgutmigi4qm8ipes6mo">
+      <w:hyperlink w:history="1" r:id="rIdbpiilq47fbguhio433ogy">
         <w:r>
           <w:rPr>
             <w:rFonts w:ascii="Arial" w:cs="Arial" w:eastAsia="Arial" w:hAnsi="Arial"/>
@@ -77,7 +77,7 @@
         </w:rPr>
         <w:t xml:space="preserve"> | </w:t>
       </w:r>
-      <w:hyperlink w:history="1" r:id="rIdiksjkybouaheemjbzt5su">
+      <w:hyperlink w:history="1" r:id="rIdhr9krtnj1bpuke9ylm3ee">
         <w:r>
           <w:rPr>
             <w:rFonts w:ascii="Arial" w:cs="Arial" w:eastAsia="Arial" w:hAnsi="Arial"/>
@@ -93,7 +93,7 @@
       <w:pPr>
         <w:jc w:val="center"/>
       </w:pPr>
-      <w:hyperlink w:history="1" r:id="rIdidmzcocs-el_gdocxcch_">
+      <w:hyperlink w:history="1" r:id="rIdvu8lcxe_rduhniri_r-9g">
         <w:r>
           <w:rPr>
             <w:rFonts w:ascii="Arial" w:cs="Arial" w:eastAsia="Arial" w:hAnsi="Arial"/>
@@ -113,7 +113,7 @@
         </w:rPr>
         <w:t xml:space="preserve"> | </w:t>
       </w:r>
-      <w:hyperlink w:history="1" r:id="rIdbnkua7jjxcamdxzygeap3">
+      <w:hyperlink w:history="1" r:id="rIdhnrtv_fkebmmx751a17ln">
         <w:r>
           <w:rPr>
             <w:rFonts w:ascii="Arial" w:cs="Arial" w:eastAsia="Arial" w:hAnsi="Arial"/>
@@ -133,7 +133,7 @@
         </w:rPr>
         <w:t xml:space="preserve"> | </w:t>
       </w:r>
-      <w:hyperlink w:history="1" r:id="rIdy24kmj9vtgnxsygzbbrnb">
+      <w:hyperlink w:history="1" r:id="rIdusrhpvsbq3gxom60mi21t">
         <w:r>
           <w:rPr>
             <w:rFonts w:ascii="Arial" w:cs="Arial" w:eastAsia="Arial" w:hAnsi="Arial"/>
@@ -215,7 +215,7 @@
           <w:sz w:val="20"/>
           <w:szCs w:val="20"/>
         </w:rPr>
-        <w:t xml:space="preserve">React, Next.js, Angular, TypeScript, Redux Toolkit, Tailwind CSS, Framer Motion</w:t>
+        <w:t xml:space="preserve">React, Next.js, Angular, TypeScript, Redux Toolkit, Material UI, Tailwind CSS, Framer Motion</w:t>
       </w:r>
     </w:p>
     <w:p>
@@ -237,7 +237,7 @@
           <w:sz w:val="20"/>
           <w:szCs w:val="20"/>
         </w:rPr>
-        <w:t xml:space="preserve">Node.js, NestJS, Express, GraphQL, Socket.io, Redis, BullMQ, JWT Auth</w:t>
+        <w:t xml:space="preserve">Node.js, NestJS, Express, GraphQL, Socket.io, Redis, BullMQ, JWT, OAuth 2.0</w:t>
       </w:r>
     </w:p>
     <w:p>
@@ -304,28 +304,6 @@
           <w:szCs w:val="20"/>
         </w:rPr>
         <w:t xml:space="preserve">JavaScript, TypeScript, HTML, CSS, SASS, SQL, Python, C</w:t>
-      </w:r>
-    </w:p>
-    <w:p>
-      <w:r>
-        <w:rPr>
-          <w:rFonts w:ascii="Arial" w:cs="Arial" w:eastAsia="Arial" w:hAnsi="Arial"/>
-          <w:b/>
-          <w:bCs/>
-          <w:color w:val="111318"/>
-          <w:sz w:val="20"/>
-          <w:szCs w:val="20"/>
-        </w:rPr>
-        <w:t xml:space="preserve">Cloud: </w:t>
-      </w:r>
-      <w:r>
-        <w:rPr>
-          <w:rFonts w:ascii="Arial" w:cs="Arial" w:eastAsia="Arial" w:hAnsi="Arial"/>
-          <w:color w:val="111318"/>
-          <w:sz w:val="20"/>
-          <w:szCs w:val="20"/>
-        </w:rPr>
-        <w:t xml:space="preserve">Vercel, Render, Heroku, Neon PostgreSQL, Upstash Redis, Cloudflare R2</w:t>
       </w:r>
     </w:p>
     <w:p>
@@ -470,7 +448,7 @@
           <w:sz w:val="20"/>
           <w:szCs w:val="20"/>
         </w:rPr>
-        <w:t xml:space="preserve">Led the front end of a client procurement platform: designed the interface in Figma and shipped it with 566 Vitest tests across 49 files.</w:t>
+        <w:t xml:space="preserve">Led the front end of a client procurement platform and designed its interface in Figma.</w:t>
       </w:r>
     </w:p>
     <w:p>
@@ -592,7 +570,16 @@
           <w:sz w:val="22"/>
           <w:szCs w:val="22"/>
         </w:rPr>
-        <w:t xml:space="preserve">SmartShift: a shift-scheduling platform for hospitals.</w:t>
+        <w:t xml:space="preserve">SmartShift</w:t>
+      </w:r>
+      <w:r>
+        <w:rPr>
+          <w:rFonts w:ascii="Arial" w:cs="Arial" w:eastAsia="Arial" w:hAnsi="Arial"/>
+          <w:color w:val="111318"/>
+          <w:sz w:val="22"/>
+          <w:szCs w:val="22"/>
+        </w:rPr>
+        <w:t xml:space="preserve"> | Shift-scheduling platform for hospitals</w:t>
       </w:r>
     </w:p>
     <w:p>
@@ -642,14 +629,14 @@
           <w:sz w:val="20"/>
           <w:szCs w:val="20"/>
         </w:rPr>
-        <w:t xml:space="preserve">76 / 102 API commits are mine; 3 apps: API, React, Angular.</w:t>
-      </w:r>
-    </w:p>
-    <w:p>
-      <w:r>
-        <w:rPr>
-          <w:rFonts w:ascii="Arial" w:cs="Arial" w:eastAsia="Arial" w:hAnsi="Arial"/>
-          <w:color w:val="111318"/>
+        <w:t xml:space="preserve">76 / 102 API commits authored; 3 apps: API, React, Angular.</w:t>
+      </w:r>
+    </w:p>
+    <w:p>
+      <w:r>
+        <w:rPr>
+          <w:rFonts w:ascii="Arial" w:cs="Arial" w:eastAsia="Arial" w:hAnsi="Arial"/>
+          <w:color w:val="3F4552"/>
           <w:sz w:val="20"/>
           <w:szCs w:val="20"/>
         </w:rPr>
@@ -670,7 +657,16 @@
           <w:sz w:val="22"/>
           <w:szCs w:val="22"/>
         </w:rPr>
-        <w:t xml:space="preserve">Signoff - Content Management System: a content platform for editorial teams.</w:t>
+        <w:t xml:space="preserve">Signoff - Content Management System</w:t>
+      </w:r>
+      <w:r>
+        <w:rPr>
+          <w:rFonts w:ascii="Arial" w:cs="Arial" w:eastAsia="Arial" w:hAnsi="Arial"/>
+          <w:color w:val="111318"/>
+          <w:sz w:val="22"/>
+          <w:szCs w:val="22"/>
+        </w:rPr>
+        <w:t xml:space="preserve"> | Content platform for editorial teams</w:t>
       </w:r>
     </w:p>
     <w:p>
@@ -727,7 +723,7 @@
       <w:r>
         <w:rPr>
           <w:rFonts w:ascii="Arial" w:cs="Arial" w:eastAsia="Arial" w:hAnsi="Arial"/>
-          <w:color w:val="111318"/>
+          <w:color w:val="3F4552"/>
           <w:sz w:val="20"/>
           <w:szCs w:val="20"/>
         </w:rPr>
@@ -748,7 +744,16 @@
           <w:sz w:val="22"/>
           <w:szCs w:val="22"/>
         </w:rPr>
-        <w:t xml:space="preserve">Trigo - Ride-Hailing Backend: the real-time API behind a ride-hailing app.</w:t>
+        <w:t xml:space="preserve">Trigo - Ride-Hailing Backend</w:t>
+      </w:r>
+      <w:r>
+        <w:rPr>
+          <w:rFonts w:ascii="Arial" w:cs="Arial" w:eastAsia="Arial" w:hAnsi="Arial"/>
+          <w:color w:val="111318"/>
+          <w:sz w:val="22"/>
+          <w:szCs w:val="22"/>
+        </w:rPr>
+        <w:t xml:space="preserve"> | Real-time API behind a ride-hailing app</w:t>
       </w:r>
     </w:p>
     <w:p>
@@ -798,14 +803,14 @@
           <w:sz w:val="20"/>
           <w:szCs w:val="20"/>
         </w:rPr>
-        <w:t xml:space="preserve">639 unit tests; 136 documented endpoints; 17 / 24 commits are mine.</w:t>
-      </w:r>
-    </w:p>
-    <w:p>
-      <w:r>
-        <w:rPr>
-          <w:rFonts w:ascii="Arial" w:cs="Arial" w:eastAsia="Arial" w:hAnsi="Arial"/>
-          <w:color w:val="111318"/>
+        <w:t xml:space="preserve">639 unit tests; 136 documented endpoints; 17 / 24 commits authored.</w:t>
+      </w:r>
+    </w:p>
+    <w:p>
+      <w:r>
+        <w:rPr>
+          <w:rFonts w:ascii="Arial" w:cs="Arial" w:eastAsia="Arial" w:hAnsi="Arial"/>
+          <w:color w:val="3F4552"/>
           <w:sz w:val="20"/>
           <w:szCs w:val="20"/>
         </w:rPr>
@@ -834,6 +839,7 @@
     </w:p>
     <w:p>
       <w:pPr>
+        <w:keepNext/>
         <w:spacing w:before="0"/>
       </w:pPr>
       <w:r>
@@ -842,11 +848,16 @@
           <w:b/>
           <w:bCs/>
           <w:color w:val="111318"/>
-          <w:sz w:val="20"/>
-          <w:szCs w:val="20"/>
+          <w:sz w:val="22"/>
+          <w:szCs w:val="22"/>
         </w:rPr>
         <w:t xml:space="preserve">B.Sc. Communication &amp; Electronics Engineering</w:t>
       </w:r>
+    </w:p>
+    <w:p>
+      <w:pPr>
+        <w:keepNext/>
+      </w:pPr>
       <w:r>
         <w:rPr>
           <w:rFonts w:ascii="Arial" w:cs="Arial" w:eastAsia="Arial" w:hAnsi="Arial"/>
@@ -854,7 +865,7 @@
           <w:sz w:val="20"/>
           <w:szCs w:val="20"/>
         </w:rPr>
-        <w:t xml:space="preserve"> | 6 October High Institute for Engineering &amp; Technology | 2014 - 2019</w:t>
+        <w:t xml:space="preserve">6 October High Institute for Engineering &amp; Technology | 2014 - 2019</w:t>
       </w:r>
     </w:p>
     <w:p>
@@ -879,6 +890,7 @@
     </w:p>
     <w:p>
       <w:pPr>
+        <w:keepNext/>
         <w:spacing w:before="0"/>
       </w:pPr>
       <w:r>
@@ -887,11 +899,16 @@
           <w:b/>
           <w:bCs/>
           <w:color w:val="111318"/>
-          <w:sz w:val="20"/>
-          <w:szCs w:val="20"/>
+          <w:sz w:val="22"/>
+          <w:szCs w:val="22"/>
         </w:rPr>
         <w:t xml:space="preserve">Full Stack Intensive Code Camp - MEARN Stack</w:t>
       </w:r>
+    </w:p>
+    <w:p>
+      <w:pPr>
+        <w:keepNext/>
+      </w:pPr>
       <w:r>
         <w:rPr>
           <w:rFonts w:ascii="Arial" w:cs="Arial" w:eastAsia="Arial" w:hAnsi="Arial"/>
@@ -899,7 +916,7 @@
           <w:sz w:val="20"/>
           <w:szCs w:val="20"/>
         </w:rPr>
-        <w:t xml:space="preserve"> | Information Technology Institute (ITI) | Jul 2025 - Dec 2025</w:t>
+        <w:t xml:space="preserve">Information Technology Institute (ITI) | Jul 2025 - Dec 2025</w:t>
       </w:r>
     </w:p>
     <w:sectPr>

</xml_diff>

<commit_message>
CV: dates right-aligned instead of pipe-separated, bullets as text, Agile/Scrum and cloud deployment in the project bullets
Co-Authored-By: Claude Opus 5.5 <noreply@anthropic.com>
</commit_message>
<xml_diff>
--- a/public/Montaser-Ismail-CV.docx
+++ b/public/Montaser-Ismail-CV.docx
@@ -57,7 +57,7 @@
         </w:rPr>
         <w:t xml:space="preserve"> | </w:t>
       </w:r>
-      <w:hyperlink w:history="1" r:id="rIdbpiilq47fbguhio433ogy">
+      <w:hyperlink w:history="1" r:id="rIda5cvtsqwjjmubzisuypbr">
         <w:r>
           <w:rPr>
             <w:rFonts w:ascii="Arial" w:cs="Arial" w:eastAsia="Arial" w:hAnsi="Arial"/>
@@ -77,7 +77,7 @@
         </w:rPr>
         <w:t xml:space="preserve"> | </w:t>
       </w:r>
-      <w:hyperlink w:history="1" r:id="rIdhr9krtnj1bpuke9ylm3ee">
+      <w:hyperlink w:history="1" r:id="rIdp8ue2id9tun95ybzpy8p_">
         <w:r>
           <w:rPr>
             <w:rFonts w:ascii="Arial" w:cs="Arial" w:eastAsia="Arial" w:hAnsi="Arial"/>
@@ -93,7 +93,7 @@
       <w:pPr>
         <w:jc w:val="center"/>
       </w:pPr>
-      <w:hyperlink w:history="1" r:id="rIdvu8lcxe_rduhniri_r-9g">
+      <w:hyperlink w:history="1" r:id="rId_ghiuytu2yo7c3eo3h-zj">
         <w:r>
           <w:rPr>
             <w:rFonts w:ascii="Arial" w:cs="Arial" w:eastAsia="Arial" w:hAnsi="Arial"/>
@@ -113,7 +113,7 @@
         </w:rPr>
         <w:t xml:space="preserve"> | </w:t>
       </w:r>
-      <w:hyperlink w:history="1" r:id="rIdhnrtv_fkebmmx751a17ln">
+      <w:hyperlink w:history="1" r:id="rIdugc25lfpejmwv6vvthayv">
         <w:r>
           <w:rPr>
             <w:rFonts w:ascii="Arial" w:cs="Arial" w:eastAsia="Arial" w:hAnsi="Arial"/>
@@ -133,7 +133,7 @@
         </w:rPr>
         <w:t xml:space="preserve"> | </w:t>
       </w:r>
-      <w:hyperlink w:history="1" r:id="rIdusrhpvsbq3gxom60mi21t">
+      <w:hyperlink w:history="1" r:id="rIdcf2hbzun1sgezz-n-orot">
         <w:r>
           <w:rPr>
             <w:rFonts w:ascii="Arial" w:cs="Arial" w:eastAsia="Arial" w:hAnsi="Arial"/>
@@ -325,7 +325,7 @@
           <w:sz w:val="20"/>
           <w:szCs w:val="20"/>
         </w:rPr>
-        <w:t xml:space="preserve">OOP, SOLID, Design patterns, REST and GraphQL API design, Git, Linux</w:t>
+        <w:t xml:space="preserve">Agile / Scrum, OOP, SOLID, Design patterns, REST and GraphQL API design, Git, Linux</w:t>
       </w:r>
     </w:p>
     <w:p>
@@ -368,15 +368,28 @@
     <w:p>
       <w:pPr>
         <w:keepNext/>
-      </w:pPr>
-      <w:r>
-        <w:rPr>
-          <w:rFonts w:ascii="Arial" w:cs="Arial" w:eastAsia="Arial" w:hAnsi="Arial"/>
-          <w:color w:val="3F4552"/>
-          <w:sz w:val="20"/>
-          <w:szCs w:val="20"/>
-        </w:rPr>
-        <w:t xml:space="preserve">Arkaan International Group Co. | Dec 2025 - Present</w:t>
+        <w:tabs>
+          <w:tab w:val="right" w:pos="10204"/>
+        </w:tabs>
+      </w:pPr>
+      <w:r>
+        <w:rPr>
+          <w:rFonts w:ascii="Arial" w:cs="Arial" w:eastAsia="Arial" w:hAnsi="Arial"/>
+          <w:color w:val="3F4552"/>
+          <w:sz w:val="20"/>
+          <w:szCs w:val="20"/>
+        </w:rPr>
+        <w:t xml:space="preserve">Arkaan International Group Co.</w:t>
+      </w:r>
+      <w:r>
+        <w:rPr>
+          <w:rFonts w:ascii="Arial" w:cs="Arial" w:eastAsia="Arial" w:hAnsi="Arial"/>
+          <w:color w:val="3F4552"/>
+          <w:sz w:val="20"/>
+          <w:szCs w:val="20"/>
+        </w:rPr>
+        <w:tab/>
+        <w:t xml:space="preserve">Dec 2025 - Present</w:t>
       </w:r>
     </w:p>
     <w:p>
@@ -471,15 +484,28 @@
     <w:p>
       <w:pPr>
         <w:keepNext/>
-      </w:pPr>
-      <w:r>
-        <w:rPr>
-          <w:rFonts w:ascii="Arial" w:cs="Arial" w:eastAsia="Arial" w:hAnsi="Arial"/>
-          <w:color w:val="3F4552"/>
-          <w:sz w:val="20"/>
-          <w:szCs w:val="20"/>
-        </w:rPr>
-        <w:t xml:space="preserve">Qyser Tech. | Sep 2024 - Mar 2026</w:t>
+        <w:tabs>
+          <w:tab w:val="right" w:pos="10204"/>
+        </w:tabs>
+      </w:pPr>
+      <w:r>
+        <w:rPr>
+          <w:rFonts w:ascii="Arial" w:cs="Arial" w:eastAsia="Arial" w:hAnsi="Arial"/>
+          <w:color w:val="3F4552"/>
+          <w:sz w:val="20"/>
+          <w:szCs w:val="20"/>
+        </w:rPr>
+        <w:t xml:space="preserve">Qyser Tech.</w:t>
+      </w:r>
+      <w:r>
+        <w:rPr>
+          <w:rFonts w:ascii="Arial" w:cs="Arial" w:eastAsia="Arial" w:hAnsi="Arial"/>
+          <w:color w:val="3F4552"/>
+          <w:sz w:val="20"/>
+          <w:szCs w:val="20"/>
+        </w:rPr>
+        <w:tab/>
+        <w:t xml:space="preserve">Sep 2024 - Mar 2026</w:t>
       </w:r>
     </w:p>
     <w:p>
@@ -579,21 +605,34 @@
           <w:sz w:val="22"/>
           <w:szCs w:val="22"/>
         </w:rPr>
-        <w:t xml:space="preserve"> | Shift-scheduling platform for hospitals</w:t>
-      </w:r>
-    </w:p>
-    <w:p>
-      <w:pPr>
-        <w:keepNext/>
-      </w:pPr>
-      <w:r>
-        <w:rPr>
-          <w:rFonts w:ascii="Arial" w:cs="Arial" w:eastAsia="Arial" w:hAnsi="Arial"/>
-          <w:color w:val="3F4552"/>
-          <w:sz w:val="20"/>
-          <w:szCs w:val="20"/>
-        </w:rPr>
-        <w:t xml:space="preserve">Full-stack engineer, API lead | Team project | Oct 2025 - Nov 2025</w:t>
+        <w:t xml:space="preserve">: Shift-scheduling platform for hospitals</w:t>
+      </w:r>
+    </w:p>
+    <w:p>
+      <w:pPr>
+        <w:keepNext/>
+        <w:tabs>
+          <w:tab w:val="right" w:pos="10204"/>
+        </w:tabs>
+      </w:pPr>
+      <w:r>
+        <w:rPr>
+          <w:rFonts w:ascii="Arial" w:cs="Arial" w:eastAsia="Arial" w:hAnsi="Arial"/>
+          <w:color w:val="3F4552"/>
+          <w:sz w:val="20"/>
+          <w:szCs w:val="20"/>
+        </w:rPr>
+        <w:t xml:space="preserve">Full-stack engineer, API lead - Team project</w:t>
+      </w:r>
+      <w:r>
+        <w:rPr>
+          <w:rFonts w:ascii="Arial" w:cs="Arial" w:eastAsia="Arial" w:hAnsi="Arial"/>
+          <w:color w:val="3F4552"/>
+          <w:sz w:val="20"/>
+          <w:szCs w:val="20"/>
+        </w:rPr>
+        <w:tab/>
+        <w:t xml:space="preserve">Oct 2025 - Nov 2025</w:t>
       </w:r>
     </w:p>
     <w:p>
@@ -611,7 +650,7 @@
           <w:sz w:val="20"/>
           <w:szCs w:val="20"/>
         </w:rPr>
-        <w:t xml:space="preserve">Built the GitHub Actions CI/CD: Nx lint, test and build on each push; Docker image deployed to Heroku.</w:t>
+        <w:t xml:space="preserve">Built the CI/CD pipeline in GitHub Actions (Nx lint, test and build on each push) and deployed the Dockerized API to the cloud on Heroku.</w:t>
       </w:r>
     </w:p>
     <w:p>
@@ -666,21 +705,34 @@
           <w:sz w:val="22"/>
           <w:szCs w:val="22"/>
         </w:rPr>
-        <w:t xml:space="preserve"> | Content platform for editorial teams</w:t>
-      </w:r>
-    </w:p>
-    <w:p>
-      <w:pPr>
-        <w:keepNext/>
-      </w:pPr>
-      <w:r>
-        <w:rPr>
-          <w:rFonts w:ascii="Arial" w:cs="Arial" w:eastAsia="Arial" w:hAnsi="Arial"/>
-          <w:color w:val="3F4552"/>
-          <w:sz w:val="20"/>
-          <w:szCs w:val="20"/>
-        </w:rPr>
-        <w:t xml:space="preserve">Full-stack engineer | Own product, live | Sep 2026 - Present</w:t>
+        <w:t xml:space="preserve">: Content platform for editorial teams</w:t>
+      </w:r>
+    </w:p>
+    <w:p>
+      <w:pPr>
+        <w:keepNext/>
+        <w:tabs>
+          <w:tab w:val="right" w:pos="10204"/>
+        </w:tabs>
+      </w:pPr>
+      <w:r>
+        <w:rPr>
+          <w:rFonts w:ascii="Arial" w:cs="Arial" w:eastAsia="Arial" w:hAnsi="Arial"/>
+          <w:color w:val="3F4552"/>
+          <w:sz w:val="20"/>
+          <w:szCs w:val="20"/>
+        </w:rPr>
+        <w:t xml:space="preserve">Full-stack engineer - Own product, live</w:t>
+      </w:r>
+      <w:r>
+        <w:rPr>
+          <w:rFonts w:ascii="Arial" w:cs="Arial" w:eastAsia="Arial" w:hAnsi="Arial"/>
+          <w:color w:val="3F4552"/>
+          <w:sz w:val="20"/>
+          <w:szCs w:val="20"/>
+        </w:rPr>
+        <w:tab/>
+        <w:t xml:space="preserve">Sep 2026 - Present</w:t>
       </w:r>
     </w:p>
     <w:p>
@@ -698,7 +750,7 @@
           <w:sz w:val="20"/>
           <w:szCs w:val="20"/>
         </w:rPr>
-        <w:t xml:space="preserve">Runs on Vercel and Render with Neon PostgreSQL, Upstash Redis and Cloudflare R2; GitHub Actions CI runs lint and tests.</w:t>
+        <w:t xml:space="preserve">Deployed to the cloud on Vercel and Render with managed PostgreSQL, Redis and S3-compatible storage; GitHub Actions CI runs lint and tests.</w:t>
       </w:r>
     </w:p>
     <w:p>
@@ -753,21 +805,34 @@
           <w:sz w:val="22"/>
           <w:szCs w:val="22"/>
         </w:rPr>
-        <w:t xml:space="preserve"> | Real-time API behind a ride-hailing app</w:t>
-      </w:r>
-    </w:p>
-    <w:p>
-      <w:pPr>
-        <w:keepNext/>
-      </w:pPr>
-      <w:r>
-        <w:rPr>
-          <w:rFonts w:ascii="Arial" w:cs="Arial" w:eastAsia="Arial" w:hAnsi="Arial"/>
-          <w:color w:val="3F4552"/>
-          <w:sz w:val="20"/>
-          <w:szCs w:val="20"/>
-        </w:rPr>
-        <w:t xml:space="preserve">Backend developer | Delivery Quote Ltd, team project | Dec 2025 - Feb 2026</w:t>
+        <w:t xml:space="preserve">: Real-time API behind a ride-hailing app</w:t>
+      </w:r>
+    </w:p>
+    <w:p>
+      <w:pPr>
+        <w:keepNext/>
+        <w:tabs>
+          <w:tab w:val="right" w:pos="10204"/>
+        </w:tabs>
+      </w:pPr>
+      <w:r>
+        <w:rPr>
+          <w:rFonts w:ascii="Arial" w:cs="Arial" w:eastAsia="Arial" w:hAnsi="Arial"/>
+          <w:color w:val="3F4552"/>
+          <w:sz w:val="20"/>
+          <w:szCs w:val="20"/>
+        </w:rPr>
+        <w:t xml:space="preserve">Backend developer - Delivery Quote Ltd, team project</w:t>
+      </w:r>
+      <w:r>
+        <w:rPr>
+          <w:rFonts w:ascii="Arial" w:cs="Arial" w:eastAsia="Arial" w:hAnsi="Arial"/>
+          <w:color w:val="3F4552"/>
+          <w:sz w:val="20"/>
+          <w:szCs w:val="20"/>
+        </w:rPr>
+        <w:tab/>
+        <w:t xml:space="preserve">Dec 2025 - Feb 2026</w:t>
       </w:r>
     </w:p>
     <w:p>
@@ -857,15 +922,28 @@
     <w:p>
       <w:pPr>
         <w:keepNext/>
-      </w:pPr>
-      <w:r>
-        <w:rPr>
-          <w:rFonts w:ascii="Arial" w:cs="Arial" w:eastAsia="Arial" w:hAnsi="Arial"/>
-          <w:color w:val="3F4552"/>
-          <w:sz w:val="20"/>
-          <w:szCs w:val="20"/>
-        </w:rPr>
-        <w:t xml:space="preserve">6 October High Institute for Engineering &amp; Technology | 2014 - 2019</w:t>
+        <w:tabs>
+          <w:tab w:val="right" w:pos="10204"/>
+        </w:tabs>
+      </w:pPr>
+      <w:r>
+        <w:rPr>
+          <w:rFonts w:ascii="Arial" w:cs="Arial" w:eastAsia="Arial" w:hAnsi="Arial"/>
+          <w:color w:val="3F4552"/>
+          <w:sz w:val="20"/>
+          <w:szCs w:val="20"/>
+        </w:rPr>
+        <w:t xml:space="preserve">6 October High Institute for Engineering &amp; Technology</w:t>
+      </w:r>
+      <w:r>
+        <w:rPr>
+          <w:rFonts w:ascii="Arial" w:cs="Arial" w:eastAsia="Arial" w:hAnsi="Arial"/>
+          <w:color w:val="3F4552"/>
+          <w:sz w:val="20"/>
+          <w:szCs w:val="20"/>
+        </w:rPr>
+        <w:tab/>
+        <w:t xml:space="preserve">2014 - 2019</w:t>
       </w:r>
     </w:p>
     <w:p>
@@ -908,15 +986,28 @@
     <w:p>
       <w:pPr>
         <w:keepNext/>
-      </w:pPr>
-      <w:r>
-        <w:rPr>
-          <w:rFonts w:ascii="Arial" w:cs="Arial" w:eastAsia="Arial" w:hAnsi="Arial"/>
-          <w:color w:val="3F4552"/>
-          <w:sz w:val="20"/>
-          <w:szCs w:val="20"/>
-        </w:rPr>
-        <w:t xml:space="preserve">Information Technology Institute (ITI) | Jul 2025 - Dec 2025</w:t>
+        <w:tabs>
+          <w:tab w:val="right" w:pos="10204"/>
+        </w:tabs>
+      </w:pPr>
+      <w:r>
+        <w:rPr>
+          <w:rFonts w:ascii="Arial" w:cs="Arial" w:eastAsia="Arial" w:hAnsi="Arial"/>
+          <w:color w:val="3F4552"/>
+          <w:sz w:val="20"/>
+          <w:szCs w:val="20"/>
+        </w:rPr>
+        <w:t xml:space="preserve">Information Technology Institute (ITI)</w:t>
+      </w:r>
+      <w:r>
+        <w:rPr>
+          <w:rFonts w:ascii="Arial" w:cs="Arial" w:eastAsia="Arial" w:hAnsi="Arial"/>
+          <w:color w:val="3F4552"/>
+          <w:sz w:val="20"/>
+          <w:szCs w:val="20"/>
+        </w:rPr>
+        <w:tab/>
+        <w:t xml:space="preserve">Jul 2025 - Dec 2025</w:t>
       </w:r>
     </w:p>
     <w:sectPr>

</xml_diff>

<commit_message>
Skills: HTML, CSS and SASS under Frontend, SQL under Data, the rest as Programming languages
The CV's "Languages" line mixed markup and query languages with programming
languages, and parsers read it as spoken languages.

Co-Authored-By: Claude Opus 5.5 <noreply@anthropic.com>
</commit_message>
<xml_diff>
--- a/public/Montaser-Ismail-CV.docx
+++ b/public/Montaser-Ismail-CV.docx
@@ -57,7 +57,7 @@
         </w:rPr>
         <w:t xml:space="preserve"> | </w:t>
       </w:r>
-      <w:hyperlink w:history="1" r:id="rIda5cvtsqwjjmubzisuypbr">
+      <w:hyperlink w:history="1" r:id="rIdt7vsobzto88fu-rt6v-n0">
         <w:r>
           <w:rPr>
             <w:rFonts w:ascii="Arial" w:cs="Arial" w:eastAsia="Arial" w:hAnsi="Arial"/>
@@ -77,7 +77,7 @@
         </w:rPr>
         <w:t xml:space="preserve"> | </w:t>
       </w:r>
-      <w:hyperlink w:history="1" r:id="rIdp8ue2id9tun95ybzpy8p_">
+      <w:hyperlink w:history="1" r:id="rIdqfywxg_otjuyu31qxomuw">
         <w:r>
           <w:rPr>
             <w:rFonts w:ascii="Arial" w:cs="Arial" w:eastAsia="Arial" w:hAnsi="Arial"/>
@@ -93,7 +93,7 @@
       <w:pPr>
         <w:jc w:val="center"/>
       </w:pPr>
-      <w:hyperlink w:history="1" r:id="rId_ghiuytu2yo7c3eo3h-zj">
+      <w:hyperlink w:history="1" r:id="rIdswukkmz0l-jnkqyf-s0o1">
         <w:r>
           <w:rPr>
             <w:rFonts w:ascii="Arial" w:cs="Arial" w:eastAsia="Arial" w:hAnsi="Arial"/>
@@ -113,7 +113,7 @@
         </w:rPr>
         <w:t xml:space="preserve"> | </w:t>
       </w:r>
-      <w:hyperlink w:history="1" r:id="rIdugc25lfpejmwv6vvthayv">
+      <w:hyperlink w:history="1" r:id="rIdrvl4bjxqrwplxpcp80dap">
         <w:r>
           <w:rPr>
             <w:rFonts w:ascii="Arial" w:cs="Arial" w:eastAsia="Arial" w:hAnsi="Arial"/>
@@ -133,7 +133,7 @@
         </w:rPr>
         <w:t xml:space="preserve"> | </w:t>
       </w:r>
-      <w:hyperlink w:history="1" r:id="rIdcf2hbzun1sgezz-n-orot">
+      <w:hyperlink w:history="1" r:id="rIdtyainl4leqro-kdhh0dfp">
         <w:r>
           <w:rPr>
             <w:rFonts w:ascii="Arial" w:cs="Arial" w:eastAsia="Arial" w:hAnsi="Arial"/>
@@ -215,7 +215,7 @@
           <w:sz w:val="20"/>
           <w:szCs w:val="20"/>
         </w:rPr>
-        <w:t xml:space="preserve">React, Next.js, Angular, TypeScript, Redux Toolkit, Material UI, Tailwind CSS, Framer Motion</w:t>
+        <w:t xml:space="preserve">React, Next.js, Angular, TypeScript, HTML, CSS, SASS, Redux Toolkit, Material UI, Tailwind CSS, Framer Motion</w:t>
       </w:r>
     </w:p>
     <w:p>
@@ -259,7 +259,7 @@
           <w:sz w:val="20"/>
           <w:szCs w:val="20"/>
         </w:rPr>
-        <w:t xml:space="preserve">MongoDB, PostgreSQL, Prisma, MySQL, SQL Server, AWS S3</w:t>
+        <w:t xml:space="preserve">MongoDB, PostgreSQL, SQL, Prisma, MySQL, SQL Server, AWS S3</w:t>
       </w:r>
     </w:p>
     <w:p>
@@ -294,16 +294,16 @@
           <w:sz w:val="20"/>
           <w:szCs w:val="20"/>
         </w:rPr>
-        <w:t xml:space="preserve">Languages: </w:t>
-      </w:r>
-      <w:r>
-        <w:rPr>
-          <w:rFonts w:ascii="Arial" w:cs="Arial" w:eastAsia="Arial" w:hAnsi="Arial"/>
-          <w:color w:val="111318"/>
-          <w:sz w:val="20"/>
-          <w:szCs w:val="20"/>
-        </w:rPr>
-        <w:t xml:space="preserve">JavaScript, TypeScript, HTML, CSS, SASS, SQL, Python, C</w:t>
+        <w:t xml:space="preserve">Programming languages: </w:t>
+      </w:r>
+      <w:r>
+        <w:rPr>
+          <w:rFonts w:ascii="Arial" w:cs="Arial" w:eastAsia="Arial" w:hAnsi="Arial"/>
+          <w:color w:val="111318"/>
+          <w:sz w:val="20"/>
+          <w:szCs w:val="20"/>
+        </w:rPr>
+        <w:t xml:space="preserve">JavaScript, TypeScript, Python, C</w:t>
       </w:r>
     </w:p>
     <w:p>

</xml_diff>

<commit_message>
Skills: drop Framer Motion so the Frontend line fits on one row
Co-Authored-By: Claude Opus 5.5 <noreply@anthropic.com>
</commit_message>
<xml_diff>
--- a/public/Montaser-Ismail-CV.docx
+++ b/public/Montaser-Ismail-CV.docx
@@ -57,7 +57,7 @@
         </w:rPr>
         <w:t xml:space="preserve"> | </w:t>
       </w:r>
-      <w:hyperlink w:history="1" r:id="rIdt7vsobzto88fu-rt6v-n0">
+      <w:hyperlink w:history="1" r:id="rId35dmveehdrqdjeblwpphx">
         <w:r>
           <w:rPr>
             <w:rFonts w:ascii="Arial" w:cs="Arial" w:eastAsia="Arial" w:hAnsi="Arial"/>
@@ -77,7 +77,7 @@
         </w:rPr>
         <w:t xml:space="preserve"> | </w:t>
       </w:r>
-      <w:hyperlink w:history="1" r:id="rIdqfywxg_otjuyu31qxomuw">
+      <w:hyperlink w:history="1" r:id="rIdcezgvdkfaqlmh9hr6teup">
         <w:r>
           <w:rPr>
             <w:rFonts w:ascii="Arial" w:cs="Arial" w:eastAsia="Arial" w:hAnsi="Arial"/>
@@ -93,7 +93,7 @@
       <w:pPr>
         <w:jc w:val="center"/>
       </w:pPr>
-      <w:hyperlink w:history="1" r:id="rIdswukkmz0l-jnkqyf-s0o1">
+      <w:hyperlink w:history="1" r:id="rIdniepbq1408newuzgxv_-o">
         <w:r>
           <w:rPr>
             <w:rFonts w:ascii="Arial" w:cs="Arial" w:eastAsia="Arial" w:hAnsi="Arial"/>
@@ -113,7 +113,7 @@
         </w:rPr>
         <w:t xml:space="preserve"> | </w:t>
       </w:r>
-      <w:hyperlink w:history="1" r:id="rIdrvl4bjxqrwplxpcp80dap">
+      <w:hyperlink w:history="1" r:id="rIdhowff0w6jd2u1uvl82iks">
         <w:r>
           <w:rPr>
             <w:rFonts w:ascii="Arial" w:cs="Arial" w:eastAsia="Arial" w:hAnsi="Arial"/>
@@ -133,7 +133,7 @@
         </w:rPr>
         <w:t xml:space="preserve"> | </w:t>
       </w:r>
-      <w:hyperlink w:history="1" r:id="rIdtyainl4leqro-kdhh0dfp">
+      <w:hyperlink w:history="1" r:id="rIdmalsojvrh1udf-xlfpseb">
         <w:r>
           <w:rPr>
             <w:rFonts w:ascii="Arial" w:cs="Arial" w:eastAsia="Arial" w:hAnsi="Arial"/>
@@ -215,7 +215,7 @@
           <w:sz w:val="20"/>
           <w:szCs w:val="20"/>
         </w:rPr>
-        <w:t xml:space="preserve">React, Next.js, Angular, TypeScript, HTML, CSS, SASS, Redux Toolkit, Material UI, Tailwind CSS, Framer Motion</w:t>
+        <w:t xml:space="preserve">React, Next.js, Angular, TypeScript, HTML, CSS, SASS, Redux Toolkit, Material UI, Tailwind CSS</w:t>
       </w:r>
     </w:p>
     <w:p>

</xml_diff>

<commit_message>
CV: employment types for overlapping roles, parser-safe dates and bullets
Qyser Tech is marked Part-time, Remote and Arkaan Full-time, and Trigo is a
freelance project, so overlapping dates read as intended (the site's
Experience section shows the type too). The Word file puts a space before the
date tab so parsers that drop tabs keep the words apart, and the PDF's text
bullets are followed by a real space.

Co-Authored-By: Claude Opus 5.5 <noreply@anthropic.com>
</commit_message>
<xml_diff>
--- a/public/Montaser-Ismail-CV.docx
+++ b/public/Montaser-Ismail-CV.docx
@@ -57,7 +57,7 @@
         </w:rPr>
         <w:t xml:space="preserve"> | </w:t>
       </w:r>
-      <w:hyperlink w:history="1" r:id="rId35dmveehdrqdjeblwpphx">
+      <w:hyperlink w:history="1" r:id="rIdwgjzpx1mjgikce0jigiyg">
         <w:r>
           <w:rPr>
             <w:rFonts w:ascii="Arial" w:cs="Arial" w:eastAsia="Arial" w:hAnsi="Arial"/>
@@ -77,7 +77,7 @@
         </w:rPr>
         <w:t xml:space="preserve"> | </w:t>
       </w:r>
-      <w:hyperlink w:history="1" r:id="rIdcezgvdkfaqlmh9hr6teup">
+      <w:hyperlink w:history="1" r:id="rIdupckzefp11r6myuufv6f6">
         <w:r>
           <w:rPr>
             <w:rFonts w:ascii="Arial" w:cs="Arial" w:eastAsia="Arial" w:hAnsi="Arial"/>
@@ -93,7 +93,7 @@
       <w:pPr>
         <w:jc w:val="center"/>
       </w:pPr>
-      <w:hyperlink w:history="1" r:id="rIdniepbq1408newuzgxv_-o">
+      <w:hyperlink w:history="1" r:id="rIdujfvpk_zpbdxyk3aqpgfd">
         <w:r>
           <w:rPr>
             <w:rFonts w:ascii="Arial" w:cs="Arial" w:eastAsia="Arial" w:hAnsi="Arial"/>
@@ -113,7 +113,7 @@
         </w:rPr>
         <w:t xml:space="preserve"> | </w:t>
       </w:r>
-      <w:hyperlink w:history="1" r:id="rIdhowff0w6jd2u1uvl82iks">
+      <w:hyperlink w:history="1" r:id="rIdldmpzrnc4pk6_s3bpdurr">
         <w:r>
           <w:rPr>
             <w:rFonts w:ascii="Arial" w:cs="Arial" w:eastAsia="Arial" w:hAnsi="Arial"/>
@@ -133,7 +133,7 @@
         </w:rPr>
         <w:t xml:space="preserve"> | </w:t>
       </w:r>
-      <w:hyperlink w:history="1" r:id="rIdmalsojvrh1udf-xlfpseb">
+      <w:hyperlink w:history="1" r:id="rIdfwgvtsqvmcxsiexdatd3d">
         <w:r>
           <w:rPr>
             <w:rFonts w:ascii="Arial" w:cs="Arial" w:eastAsia="Arial" w:hAnsi="Arial"/>
@@ -379,15 +379,16 @@
           <w:sz w:val="20"/>
           <w:szCs w:val="20"/>
         </w:rPr>
-        <w:t xml:space="preserve">Arkaan International Group Co.</w:t>
-      </w:r>
-      <w:r>
-        <w:rPr>
-          <w:rFonts w:ascii="Arial" w:cs="Arial" w:eastAsia="Arial" w:hAnsi="Arial"/>
-          <w:color w:val="3F4552"/>
-          <w:sz w:val="20"/>
-          <w:szCs w:val="20"/>
-        </w:rPr>
+        <w:t xml:space="preserve">Arkaan International Group Co. - Full-time</w:t>
+      </w:r>
+      <w:r>
+        <w:rPr>
+          <w:rFonts w:ascii="Arial" w:cs="Arial" w:eastAsia="Arial" w:hAnsi="Arial"/>
+          <w:color w:val="3F4552"/>
+          <w:sz w:val="20"/>
+          <w:szCs w:val="20"/>
+        </w:rPr>
+        <w:t xml:space="preserve"> </w:t>
         <w:tab/>
         <w:t xml:space="preserve">Dec 2025 - Present</w:t>
       </w:r>
@@ -495,15 +496,16 @@
           <w:sz w:val="20"/>
           <w:szCs w:val="20"/>
         </w:rPr>
-        <w:t xml:space="preserve">Qyser Tech.</w:t>
-      </w:r>
-      <w:r>
-        <w:rPr>
-          <w:rFonts w:ascii="Arial" w:cs="Arial" w:eastAsia="Arial" w:hAnsi="Arial"/>
-          <w:color w:val="3F4552"/>
-          <w:sz w:val="20"/>
-          <w:szCs w:val="20"/>
-        </w:rPr>
+        <w:t xml:space="preserve">Qyser Tech. - Part-time, Remote</w:t>
+      </w:r>
+      <w:r>
+        <w:rPr>
+          <w:rFonts w:ascii="Arial" w:cs="Arial" w:eastAsia="Arial" w:hAnsi="Arial"/>
+          <w:color w:val="3F4552"/>
+          <w:sz w:val="20"/>
+          <w:szCs w:val="20"/>
+        </w:rPr>
+        <w:t xml:space="preserve"> </w:t>
         <w:tab/>
         <w:t xml:space="preserve">Sep 2024 - Mar 2026</w:t>
       </w:r>
@@ -631,6 +633,7 @@
           <w:sz w:val="20"/>
           <w:szCs w:val="20"/>
         </w:rPr>
+        <w:t xml:space="preserve"> </w:t>
         <w:tab/>
         <w:t xml:space="preserve">Oct 2025 - Nov 2025</w:t>
       </w:r>
@@ -731,6 +734,7 @@
           <w:sz w:val="20"/>
           <w:szCs w:val="20"/>
         </w:rPr>
+        <w:t xml:space="preserve"> </w:t>
         <w:tab/>
         <w:t xml:space="preserve">Sep 2026 - Present</w:t>
       </w:r>
@@ -822,15 +826,16 @@
           <w:sz w:val="20"/>
           <w:szCs w:val="20"/>
         </w:rPr>
-        <w:t xml:space="preserve">Backend developer - Delivery Quote Ltd, team project</w:t>
-      </w:r>
-      <w:r>
-        <w:rPr>
-          <w:rFonts w:ascii="Arial" w:cs="Arial" w:eastAsia="Arial" w:hAnsi="Arial"/>
-          <w:color w:val="3F4552"/>
-          <w:sz w:val="20"/>
-          <w:szCs w:val="20"/>
-        </w:rPr>
+        <w:t xml:space="preserve">Backend developer - Delivery Quote Ltd, freelance, team project</w:t>
+      </w:r>
+      <w:r>
+        <w:rPr>
+          <w:rFonts w:ascii="Arial" w:cs="Arial" w:eastAsia="Arial" w:hAnsi="Arial"/>
+          <w:color w:val="3F4552"/>
+          <w:sz w:val="20"/>
+          <w:szCs w:val="20"/>
+        </w:rPr>
+        <w:t xml:space="preserve"> </w:t>
         <w:tab/>
         <w:t xml:space="preserve">Dec 2025 - Feb 2026</w:t>
       </w:r>
@@ -942,6 +947,7 @@
           <w:sz w:val="20"/>
           <w:szCs w:val="20"/>
         </w:rPr>
+        <w:t xml:space="preserve"> </w:t>
         <w:tab/>
         <w:t xml:space="preserve">2014 - 2019</w:t>
       </w:r>
@@ -1006,6 +1012,7 @@
           <w:sz w:val="20"/>
           <w:szCs w:val="20"/>
         </w:rPr>
+        <w:t xml:space="preserve"> </w:t>
         <w:tab/>
         <w:t xml:space="preserve">Jul 2025 - Dec 2025</w:t>
       </w:r>

</xml_diff>

<commit_message>
CV: no tab stops or list numbering; deploys keep the previous build's scripts
CV (both files, from the CV checker's feedback):
- Where and when share one line as plain text joined by " | "
  (metaLine in lib/cv.ts) instead of a right tab stop or a flex column.
- The Word file types its bullets ("•" and spaces, hanging indent) like
  the PDF, instead of Word list numbering parsers can't see.
- Qyser Tech reads "Part-time, concurrent, Remote".

Deploy: Pages caches HTML for 10 minutes, so after a deploy the previous
page still asks for the previous build's scripts, which used to be gone.
Each deploy now records its _next/static files in .deploy-static.txt and
the next deploy keeps exactly those, one generation back.

Co-Authored-By: Claude Opus 5.5 <noreply@anthropic.com>
</commit_message>
<xml_diff>
--- a/public/Montaser-Ismail-CV.docx
+++ b/public/Montaser-Ismail-CV.docx
@@ -57,7 +57,7 @@
         </w:rPr>
         <w:t xml:space="preserve"> | </w:t>
       </w:r>
-      <w:hyperlink w:history="1" r:id="rIdwgjzpx1mjgikce0jigiyg">
+      <w:hyperlink w:history="1" r:id="rId09cyhntywfoxqdu__vpwm">
         <w:r>
           <w:rPr>
             <w:rFonts w:ascii="Arial" w:cs="Arial" w:eastAsia="Arial" w:hAnsi="Arial"/>
@@ -77,7 +77,7 @@
         </w:rPr>
         <w:t xml:space="preserve"> | </w:t>
       </w:r>
-      <w:hyperlink w:history="1" r:id="rIdupckzefp11r6myuufv6f6">
+      <w:hyperlink w:history="1" r:id="rIdngpw77mssinetlcjzji0_">
         <w:r>
           <w:rPr>
             <w:rFonts w:ascii="Arial" w:cs="Arial" w:eastAsia="Arial" w:hAnsi="Arial"/>
@@ -93,7 +93,7 @@
       <w:pPr>
         <w:jc w:val="center"/>
       </w:pPr>
-      <w:hyperlink w:history="1" r:id="rIdujfvpk_zpbdxyk3aqpgfd">
+      <w:hyperlink w:history="1" r:id="rId5aaobz5ye-gj69h8zt81j">
         <w:r>
           <w:rPr>
             <w:rFonts w:ascii="Arial" w:cs="Arial" w:eastAsia="Arial" w:hAnsi="Arial"/>
@@ -113,7 +113,7 @@
         </w:rPr>
         <w:t xml:space="preserve"> | </w:t>
       </w:r>
-      <w:hyperlink w:history="1" r:id="rIdldmpzrnc4pk6_s3bpdurr">
+      <w:hyperlink w:history="1" r:id="rIddklboarxfpzrgk_ssbbys">
         <w:r>
           <w:rPr>
             <w:rFonts w:ascii="Arial" w:cs="Arial" w:eastAsia="Arial" w:hAnsi="Arial"/>
@@ -133,7 +133,7 @@
         </w:rPr>
         <w:t xml:space="preserve"> | </w:t>
       </w:r>
-      <w:hyperlink w:history="1" r:id="rIdfwgvtsqvmcxsiexdatd3d">
+      <w:hyperlink w:history="1" r:id="rIdlhiqsj1dv6utzof-cpkx7">
         <w:r>
           <w:rPr>
             <w:rFonts w:ascii="Arial" w:cs="Arial" w:eastAsia="Arial" w:hAnsi="Arial"/>
@@ -368,9 +368,6 @@
     <w:p>
       <w:pPr>
         <w:keepNext/>
-        <w:tabs>
-          <w:tab w:val="right" w:pos="10204"/>
-        </w:tabs>
       </w:pPr>
       <w:r>
         <w:rPr>
@@ -379,90 +376,63 @@
           <w:sz w:val="20"/>
           <w:szCs w:val="20"/>
         </w:rPr>
-        <w:t xml:space="preserve">Arkaan International Group Co. - Full-time</w:t>
-      </w:r>
-      <w:r>
-        <w:rPr>
-          <w:rFonts w:ascii="Arial" w:cs="Arial" w:eastAsia="Arial" w:hAnsi="Arial"/>
-          <w:color w:val="3F4552"/>
-          <w:sz w:val="20"/>
-          <w:szCs w:val="20"/>
-        </w:rPr>
-        <w:t xml:space="preserve"> </w:t>
-        <w:tab/>
-        <w:t xml:space="preserve">Dec 2025 - Present</w:t>
-      </w:r>
-    </w:p>
-    <w:p>
-      <w:pPr>
-        <w:pStyle w:val="ListParagraph"/>
-        <w:numPr>
-          <w:ilvl w:val="0"/>
-          <w:numId w:val="1"/>
-        </w:numPr>
-      </w:pPr>
-      <w:r>
-        <w:rPr>
-          <w:rFonts w:ascii="Arial" w:cs="Arial" w:eastAsia="Arial" w:hAnsi="Arial"/>
-          <w:color w:val="111318"/>
-          <w:sz w:val="20"/>
-          <w:szCs w:val="20"/>
-        </w:rPr>
-        <w:t xml:space="preserve">Engineered dynamic UI components rendered entirely from JSON metadata schemas, reducing manual frontend coding effort by ~40%.</w:t>
-      </w:r>
-    </w:p>
-    <w:p>
-      <w:pPr>
-        <w:pStyle w:val="ListParagraph"/>
-        <w:numPr>
-          <w:ilvl w:val="0"/>
-          <w:numId w:val="1"/>
-        </w:numPr>
-      </w:pPr>
-      <w:r>
-        <w:rPr>
-          <w:rFonts w:ascii="Arial" w:cs="Arial" w:eastAsia="Arial" w:hAnsi="Arial"/>
-          <w:color w:val="111318"/>
-          <w:sz w:val="20"/>
-          <w:szCs w:val="20"/>
-        </w:rPr>
-        <w:t xml:space="preserve">Developed configurable form builders that auto-generate layouts from backend data models, cutting form development time by ~70% across 5+ form types.</w:t>
-      </w:r>
-    </w:p>
-    <w:p>
-      <w:pPr>
-        <w:pStyle w:val="ListParagraph"/>
-        <w:numPr>
-          <w:ilvl w:val="0"/>
-          <w:numId w:val="1"/>
-        </w:numPr>
-      </w:pPr>
-      <w:r>
-        <w:rPr>
-          <w:rFonts w:ascii="Arial" w:cs="Arial" w:eastAsia="Arial" w:hAnsi="Arial"/>
-          <w:color w:val="111318"/>
-          <w:sz w:val="20"/>
-          <w:szCs w:val="20"/>
-        </w:rPr>
-        <w:t xml:space="preserve">Built a high-performance rendering engine mapping server-side metadata to reusable React components, supporting 10+ reusable component types application-wide.</w:t>
-      </w:r>
-    </w:p>
-    <w:p>
-      <w:pPr>
-        <w:pStyle w:val="ListParagraph"/>
-        <w:numPr>
-          <w:ilvl w:val="0"/>
-          <w:numId w:val="1"/>
-        </w:numPr>
-      </w:pPr>
-      <w:r>
-        <w:rPr>
-          <w:rFonts w:ascii="Arial" w:cs="Arial" w:eastAsia="Arial" w:hAnsi="Arial"/>
-          <w:color w:val="111318"/>
-          <w:sz w:val="20"/>
-          <w:szCs w:val="20"/>
-        </w:rPr>
-        <w:t xml:space="preserve">Led the front end of a client procurement platform and designed its interface in Figma.</w:t>
+        <w:t xml:space="preserve">Arkaan International Group Co. | Full-time | Dec 2025 - Present</w:t>
+      </w:r>
+    </w:p>
+    <w:p>
+      <w:pPr>
+        <w:ind w:left="180" w:hanging="180"/>
+      </w:pPr>
+      <w:r>
+        <w:rPr>
+          <w:rFonts w:ascii="Arial" w:cs="Arial" w:eastAsia="Arial" w:hAnsi="Arial"/>
+          <w:color w:val="111318"/>
+          <w:sz w:val="20"/>
+          <w:szCs w:val="20"/>
+        </w:rPr>
+        <w:t xml:space="preserve">•  Engineered dynamic UI components rendered entirely from JSON metadata schemas, reducing manual frontend coding effort by ~40%.</w:t>
+      </w:r>
+    </w:p>
+    <w:p>
+      <w:pPr>
+        <w:ind w:left="180" w:hanging="180"/>
+      </w:pPr>
+      <w:r>
+        <w:rPr>
+          <w:rFonts w:ascii="Arial" w:cs="Arial" w:eastAsia="Arial" w:hAnsi="Arial"/>
+          <w:color w:val="111318"/>
+          <w:sz w:val="20"/>
+          <w:szCs w:val="20"/>
+        </w:rPr>
+        <w:t xml:space="preserve">•  Developed configurable form builders that auto-generate layouts from backend data models, cutting form development time by ~70% across 5+ form types.</w:t>
+      </w:r>
+    </w:p>
+    <w:p>
+      <w:pPr>
+        <w:ind w:left="180" w:hanging="180"/>
+      </w:pPr>
+      <w:r>
+        <w:rPr>
+          <w:rFonts w:ascii="Arial" w:cs="Arial" w:eastAsia="Arial" w:hAnsi="Arial"/>
+          <w:color w:val="111318"/>
+          <w:sz w:val="20"/>
+          <w:szCs w:val="20"/>
+        </w:rPr>
+        <w:t xml:space="preserve">•  Built a high-performance rendering engine mapping server-side metadata to reusable React components, supporting 10+ reusable component types application-wide.</w:t>
+      </w:r>
+    </w:p>
+    <w:p>
+      <w:pPr>
+        <w:ind w:left="180" w:hanging="180"/>
+      </w:pPr>
+      <w:r>
+        <w:rPr>
+          <w:rFonts w:ascii="Arial" w:cs="Arial" w:eastAsia="Arial" w:hAnsi="Arial"/>
+          <w:color w:val="111318"/>
+          <w:sz w:val="20"/>
+          <w:szCs w:val="20"/>
+        </w:rPr>
+        <w:t xml:space="preserve">•  Led the front end of a client procurement platform and designed its interface in Figma.</w:t>
       </w:r>
     </w:p>
     <w:p>
@@ -485,9 +455,6 @@
     <w:p>
       <w:pPr>
         <w:keepNext/>
-        <w:tabs>
-          <w:tab w:val="right" w:pos="10204"/>
-        </w:tabs>
       </w:pPr>
       <w:r>
         <w:rPr>
@@ -496,72 +463,49 @@
           <w:sz w:val="20"/>
           <w:szCs w:val="20"/>
         </w:rPr>
-        <w:t xml:space="preserve">Qyser Tech. - Part-time, Remote</w:t>
-      </w:r>
-      <w:r>
-        <w:rPr>
-          <w:rFonts w:ascii="Arial" w:cs="Arial" w:eastAsia="Arial" w:hAnsi="Arial"/>
-          <w:color w:val="3F4552"/>
-          <w:sz w:val="20"/>
-          <w:szCs w:val="20"/>
-        </w:rPr>
-        <w:t xml:space="preserve"> </w:t>
-        <w:tab/>
-        <w:t xml:space="preserve">Sep 2024 - Mar 2026</w:t>
-      </w:r>
-    </w:p>
-    <w:p>
-      <w:pPr>
-        <w:pStyle w:val="ListParagraph"/>
-        <w:numPr>
-          <w:ilvl w:val="0"/>
-          <w:numId w:val="1"/>
-        </w:numPr>
-      </w:pPr>
-      <w:r>
-        <w:rPr>
-          <w:rFonts w:ascii="Arial" w:cs="Arial" w:eastAsia="Arial" w:hAnsi="Arial"/>
-          <w:color w:val="111318"/>
-          <w:sz w:val="20"/>
-          <w:szCs w:val="20"/>
-        </w:rPr>
-        <w:t xml:space="preserve">Architected modular backend services with Node.js and REST APIs, serving 500+ concurrent API requests.</w:t>
-      </w:r>
-    </w:p>
-    <w:p>
-      <w:pPr>
-        <w:pStyle w:val="ListParagraph"/>
-        <w:numPr>
-          <w:ilvl w:val="0"/>
-          <w:numId w:val="1"/>
-        </w:numPr>
-      </w:pPr>
-      <w:r>
-        <w:rPr>
-          <w:rFonts w:ascii="Arial" w:cs="Arial" w:eastAsia="Arial" w:hAnsi="Arial"/>
-          <w:color w:val="111318"/>
-          <w:sz w:val="20"/>
-          <w:szCs w:val="20"/>
-        </w:rPr>
-        <w:t xml:space="preserve">Built dynamic report generation features with complex queries and aggregations, processing across 100K+ records.</w:t>
-      </w:r>
-    </w:p>
-    <w:p>
-      <w:pPr>
-        <w:pStyle w:val="ListParagraph"/>
-        <w:numPr>
-          <w:ilvl w:val="0"/>
-          <w:numId w:val="1"/>
-        </w:numPr>
-      </w:pPr>
-      <w:r>
-        <w:rPr>
-          <w:rFonts w:ascii="Arial" w:cs="Arial" w:eastAsia="Arial" w:hAnsi="Arial"/>
-          <w:color w:val="111318"/>
-          <w:sz w:val="20"/>
-          <w:szCs w:val="20"/>
-        </w:rPr>
-        <w:t xml:space="preserve">Delivered the "Performance" feature using MongoDB aggregations to generate employee insights and support admin approvals, cutting manual HR reporting time by ~60%.</w:t>
+        <w:t xml:space="preserve">Qyser Tech. | Part-time, concurrent, Remote | Sep 2024 - Mar 2026</w:t>
+      </w:r>
+    </w:p>
+    <w:p>
+      <w:pPr>
+        <w:ind w:left="180" w:hanging="180"/>
+      </w:pPr>
+      <w:r>
+        <w:rPr>
+          <w:rFonts w:ascii="Arial" w:cs="Arial" w:eastAsia="Arial" w:hAnsi="Arial"/>
+          <w:color w:val="111318"/>
+          <w:sz w:val="20"/>
+          <w:szCs w:val="20"/>
+        </w:rPr>
+        <w:t xml:space="preserve">•  Architected modular backend services with Node.js and REST APIs, serving 500+ concurrent API requests.</w:t>
+      </w:r>
+    </w:p>
+    <w:p>
+      <w:pPr>
+        <w:ind w:left="180" w:hanging="180"/>
+      </w:pPr>
+      <w:r>
+        <w:rPr>
+          <w:rFonts w:ascii="Arial" w:cs="Arial" w:eastAsia="Arial" w:hAnsi="Arial"/>
+          <w:color w:val="111318"/>
+          <w:sz w:val="20"/>
+          <w:szCs w:val="20"/>
+        </w:rPr>
+        <w:t xml:space="preserve">•  Built dynamic report generation features with complex queries and aggregations, processing across 100K+ records.</w:t>
+      </w:r>
+    </w:p>
+    <w:p>
+      <w:pPr>
+        <w:ind w:left="180" w:hanging="180"/>
+      </w:pPr>
+      <w:r>
+        <w:rPr>
+          <w:rFonts w:ascii="Arial" w:cs="Arial" w:eastAsia="Arial" w:hAnsi="Arial"/>
+          <w:color w:val="111318"/>
+          <w:sz w:val="20"/>
+          <w:szCs w:val="20"/>
+        </w:rPr>
+        <w:t xml:space="preserve">•  Delivered the "Performance" feature using MongoDB aggregations to generate employee insights and support admin approvals, cutting manual HR reporting time by ~60%.</w:t>
       </w:r>
     </w:p>
     <w:p>
@@ -613,9 +557,6 @@
     <w:p>
       <w:pPr>
         <w:keepNext/>
-        <w:tabs>
-          <w:tab w:val="right" w:pos="10204"/>
-        </w:tabs>
       </w:pPr>
       <w:r>
         <w:rPr>
@@ -624,54 +565,35 @@
           <w:sz w:val="20"/>
           <w:szCs w:val="20"/>
         </w:rPr>
-        <w:t xml:space="preserve">Full-stack engineer, API lead - Team project</w:t>
-      </w:r>
-      <w:r>
-        <w:rPr>
-          <w:rFonts w:ascii="Arial" w:cs="Arial" w:eastAsia="Arial" w:hAnsi="Arial"/>
-          <w:color w:val="3F4552"/>
-          <w:sz w:val="20"/>
-          <w:szCs w:val="20"/>
-        </w:rPr>
-        <w:t xml:space="preserve"> </w:t>
-        <w:tab/>
-        <w:t xml:space="preserve">Oct 2025 - Nov 2025</w:t>
-      </w:r>
-    </w:p>
-    <w:p>
-      <w:pPr>
-        <w:pStyle w:val="ListParagraph"/>
-        <w:numPr>
-          <w:ilvl w:val="0"/>
-          <w:numId w:val="1"/>
-        </w:numPr>
-      </w:pPr>
-      <w:r>
-        <w:rPr>
-          <w:rFonts w:ascii="Arial" w:cs="Arial" w:eastAsia="Arial" w:hAnsi="Arial"/>
-          <w:color w:val="111318"/>
-          <w:sz w:val="20"/>
-          <w:szCs w:val="20"/>
-        </w:rPr>
-        <w:t xml:space="preserve">Built the CI/CD pipeline in GitHub Actions (Nx lint, test and build on each push) and deployed the Dockerized API to the cloud on Heroku.</w:t>
-      </w:r>
-    </w:p>
-    <w:p>
-      <w:pPr>
-        <w:pStyle w:val="ListParagraph"/>
-        <w:numPr>
-          <w:ilvl w:val="0"/>
-          <w:numId w:val="1"/>
-        </w:numPr>
-      </w:pPr>
-      <w:r>
-        <w:rPr>
-          <w:rFonts w:ascii="Arial" w:cs="Arial" w:eastAsia="Arial" w:hAnsi="Arial"/>
-          <w:color w:val="111318"/>
-          <w:sz w:val="20"/>
-          <w:szCs w:val="20"/>
-        </w:rPr>
-        <w:t xml:space="preserve">76 / 102 API commits authored; 3 apps: API, React, Angular.</w:t>
+        <w:t xml:space="preserve">Full-stack engineer, API lead - Team project | Oct 2025 - Nov 2025</w:t>
+      </w:r>
+    </w:p>
+    <w:p>
+      <w:pPr>
+        <w:ind w:left="180" w:hanging="180"/>
+      </w:pPr>
+      <w:r>
+        <w:rPr>
+          <w:rFonts w:ascii="Arial" w:cs="Arial" w:eastAsia="Arial" w:hAnsi="Arial"/>
+          <w:color w:val="111318"/>
+          <w:sz w:val="20"/>
+          <w:szCs w:val="20"/>
+        </w:rPr>
+        <w:t xml:space="preserve">•  Built the CI/CD pipeline in GitHub Actions (Nx lint, test and build on each push) and deployed the Dockerized API to the cloud on Heroku.</w:t>
+      </w:r>
+    </w:p>
+    <w:p>
+      <w:pPr>
+        <w:ind w:left="180" w:hanging="180"/>
+      </w:pPr>
+      <w:r>
+        <w:rPr>
+          <w:rFonts w:ascii="Arial" w:cs="Arial" w:eastAsia="Arial" w:hAnsi="Arial"/>
+          <w:color w:val="111318"/>
+          <w:sz w:val="20"/>
+          <w:szCs w:val="20"/>
+        </w:rPr>
+        <w:t xml:space="preserve">•  76 / 102 API commits authored; 3 apps: API, React, Angular.</w:t>
       </w:r>
     </w:p>
     <w:p>
@@ -714,9 +636,6 @@
     <w:p>
       <w:pPr>
         <w:keepNext/>
-        <w:tabs>
-          <w:tab w:val="right" w:pos="10204"/>
-        </w:tabs>
       </w:pPr>
       <w:r>
         <w:rPr>
@@ -725,54 +644,35 @@
           <w:sz w:val="20"/>
           <w:szCs w:val="20"/>
         </w:rPr>
-        <w:t xml:space="preserve">Full-stack engineer - Own product, live</w:t>
-      </w:r>
-      <w:r>
-        <w:rPr>
-          <w:rFonts w:ascii="Arial" w:cs="Arial" w:eastAsia="Arial" w:hAnsi="Arial"/>
-          <w:color w:val="3F4552"/>
-          <w:sz w:val="20"/>
-          <w:szCs w:val="20"/>
-        </w:rPr>
-        <w:t xml:space="preserve"> </w:t>
-        <w:tab/>
-        <w:t xml:space="preserve">Sep 2026 - Present</w:t>
-      </w:r>
-    </w:p>
-    <w:p>
-      <w:pPr>
-        <w:pStyle w:val="ListParagraph"/>
-        <w:numPr>
-          <w:ilvl w:val="0"/>
-          <w:numId w:val="1"/>
-        </w:numPr>
-      </w:pPr>
-      <w:r>
-        <w:rPr>
-          <w:rFonts w:ascii="Arial" w:cs="Arial" w:eastAsia="Arial" w:hAnsi="Arial"/>
-          <w:color w:val="111318"/>
-          <w:sz w:val="20"/>
-          <w:szCs w:val="20"/>
-        </w:rPr>
-        <w:t xml:space="preserve">Deployed to the cloud on Vercel and Render with managed PostgreSQL, Redis and S3-compatible storage; GitHub Actions CI runs lint and tests.</w:t>
-      </w:r>
-    </w:p>
-    <w:p>
-      <w:pPr>
-        <w:pStyle w:val="ListParagraph"/>
-        <w:numPr>
-          <w:ilvl w:val="0"/>
-          <w:numId w:val="1"/>
-        </w:numPr>
-      </w:pPr>
-      <w:r>
-        <w:rPr>
-          <w:rFonts w:ascii="Arial" w:cs="Arial" w:eastAsia="Arial" w:hAnsi="Arial"/>
-          <w:color w:val="111318"/>
-          <w:sz w:val="20"/>
-          <w:szCs w:val="20"/>
-        </w:rPr>
-        <w:t xml:space="preserve">104 unit tests passing; 20 end-to-end tests.</w:t>
+        <w:t xml:space="preserve">Full-stack engineer - Own product, live | Sep 2026 - Present</w:t>
+      </w:r>
+    </w:p>
+    <w:p>
+      <w:pPr>
+        <w:ind w:left="180" w:hanging="180"/>
+      </w:pPr>
+      <w:r>
+        <w:rPr>
+          <w:rFonts w:ascii="Arial" w:cs="Arial" w:eastAsia="Arial" w:hAnsi="Arial"/>
+          <w:color w:val="111318"/>
+          <w:sz w:val="20"/>
+          <w:szCs w:val="20"/>
+        </w:rPr>
+        <w:t xml:space="preserve">•  Deployed to the cloud on Vercel and Render with managed PostgreSQL, Redis and S3-compatible storage; GitHub Actions CI runs lint and tests.</w:t>
+      </w:r>
+    </w:p>
+    <w:p>
+      <w:pPr>
+        <w:ind w:left="180" w:hanging="180"/>
+      </w:pPr>
+      <w:r>
+        <w:rPr>
+          <w:rFonts w:ascii="Arial" w:cs="Arial" w:eastAsia="Arial" w:hAnsi="Arial"/>
+          <w:color w:val="111318"/>
+          <w:sz w:val="20"/>
+          <w:szCs w:val="20"/>
+        </w:rPr>
+        <w:t xml:space="preserve">•  104 unit tests passing; 20 end-to-end tests.</w:t>
       </w:r>
     </w:p>
     <w:p>
@@ -815,9 +715,6 @@
     <w:p>
       <w:pPr>
         <w:keepNext/>
-        <w:tabs>
-          <w:tab w:val="right" w:pos="10204"/>
-        </w:tabs>
       </w:pPr>
       <w:r>
         <w:rPr>
@@ -826,54 +723,35 @@
           <w:sz w:val="20"/>
           <w:szCs w:val="20"/>
         </w:rPr>
-        <w:t xml:space="preserve">Backend developer - Delivery Quote Ltd, freelance, team project</w:t>
-      </w:r>
-      <w:r>
-        <w:rPr>
-          <w:rFonts w:ascii="Arial" w:cs="Arial" w:eastAsia="Arial" w:hAnsi="Arial"/>
-          <w:color w:val="3F4552"/>
-          <w:sz w:val="20"/>
-          <w:szCs w:val="20"/>
-        </w:rPr>
-        <w:t xml:space="preserve"> </w:t>
-        <w:tab/>
-        <w:t xml:space="preserve">Dec 2025 - Feb 2026</w:t>
-      </w:r>
-    </w:p>
-    <w:p>
-      <w:pPr>
-        <w:pStyle w:val="ListParagraph"/>
-        <w:numPr>
-          <w:ilvl w:val="0"/>
-          <w:numId w:val="1"/>
-        </w:numPr>
-      </w:pPr>
-      <w:r>
-        <w:rPr>
-          <w:rFonts w:ascii="Arial" w:cs="Arial" w:eastAsia="Arial" w:hAnsi="Arial"/>
-          <w:color w:val="111318"/>
-          <w:sz w:val="20"/>
-          <w:szCs w:val="20"/>
-        </w:rPr>
-        <w:t xml:space="preserve">Live locations, chat and call signaling over Socket.io, scaled across instances with a Redis adapter.</w:t>
-      </w:r>
-    </w:p>
-    <w:p>
-      <w:pPr>
-        <w:pStyle w:val="ListParagraph"/>
-        <w:numPr>
-          <w:ilvl w:val="0"/>
-          <w:numId w:val="1"/>
-        </w:numPr>
-      </w:pPr>
-      <w:r>
-        <w:rPr>
-          <w:rFonts w:ascii="Arial" w:cs="Arial" w:eastAsia="Arial" w:hAnsi="Arial"/>
-          <w:color w:val="111318"/>
-          <w:sz w:val="20"/>
-          <w:szCs w:val="20"/>
-        </w:rPr>
-        <w:t xml:space="preserve">639 unit tests; 136 documented endpoints; 17 / 24 commits authored.</w:t>
+        <w:t xml:space="preserve">Backend developer - Delivery Quote Ltd, freelance, team project | Dec 2025 - Feb 2026</w:t>
+      </w:r>
+    </w:p>
+    <w:p>
+      <w:pPr>
+        <w:ind w:left="180" w:hanging="180"/>
+      </w:pPr>
+      <w:r>
+        <w:rPr>
+          <w:rFonts w:ascii="Arial" w:cs="Arial" w:eastAsia="Arial" w:hAnsi="Arial"/>
+          <w:color w:val="111318"/>
+          <w:sz w:val="20"/>
+          <w:szCs w:val="20"/>
+        </w:rPr>
+        <w:t xml:space="preserve">•  Live locations, chat and call signaling over Socket.io, scaled across instances with a Redis adapter.</w:t>
+      </w:r>
+    </w:p>
+    <w:p>
+      <w:pPr>
+        <w:ind w:left="180" w:hanging="180"/>
+      </w:pPr>
+      <w:r>
+        <w:rPr>
+          <w:rFonts w:ascii="Arial" w:cs="Arial" w:eastAsia="Arial" w:hAnsi="Arial"/>
+          <w:color w:val="111318"/>
+          <w:sz w:val="20"/>
+          <w:szCs w:val="20"/>
+        </w:rPr>
+        <w:t xml:space="preserve">•  639 unit tests; 136 documented endpoints; 17 / 24 commits authored.</w:t>
       </w:r>
     </w:p>
     <w:p>
@@ -927,9 +805,6 @@
     <w:p>
       <w:pPr>
         <w:keepNext/>
-        <w:tabs>
-          <w:tab w:val="right" w:pos="10204"/>
-        </w:tabs>
       </w:pPr>
       <w:r>
         <w:rPr>
@@ -938,18 +813,7 @@
           <w:sz w:val="20"/>
           <w:szCs w:val="20"/>
         </w:rPr>
-        <w:t xml:space="preserve">6 October High Institute for Engineering &amp; Technology</w:t>
-      </w:r>
-      <w:r>
-        <w:rPr>
-          <w:rFonts w:ascii="Arial" w:cs="Arial" w:eastAsia="Arial" w:hAnsi="Arial"/>
-          <w:color w:val="3F4552"/>
-          <w:sz w:val="20"/>
-          <w:szCs w:val="20"/>
-        </w:rPr>
-        <w:t xml:space="preserve"> </w:t>
-        <w:tab/>
-        <w:t xml:space="preserve">2014 - 2019</w:t>
+        <w:t xml:space="preserve">6 October High Institute for Engineering &amp; Technology | 2014 - 2019</w:t>
       </w:r>
     </w:p>
     <w:p>
@@ -992,9 +856,6 @@
     <w:p>
       <w:pPr>
         <w:keepNext/>
-        <w:tabs>
-          <w:tab w:val="right" w:pos="10204"/>
-        </w:tabs>
       </w:pPr>
       <w:r>
         <w:rPr>
@@ -1003,18 +864,7 @@
           <w:sz w:val="20"/>
           <w:szCs w:val="20"/>
         </w:rPr>
-        <w:t xml:space="preserve">Information Technology Institute (ITI)</w:t>
-      </w:r>
-      <w:r>
-        <w:rPr>
-          <w:rFonts w:ascii="Arial" w:cs="Arial" w:eastAsia="Arial" w:hAnsi="Arial"/>
-          <w:color w:val="3F4552"/>
-          <w:sz w:val="20"/>
-          <w:szCs w:val="20"/>
-        </w:rPr>
-        <w:t xml:space="preserve"> </w:t>
-        <w:tab/>
-        <w:t xml:space="preserve">Jul 2025 - Dec 2025</w:t>
+        <w:t xml:space="preserve">Information Technology Institute (ITI) | Jul 2025 - Dec 2025</w:t>
       </w:r>
     </w:p>
     <w:sectPr>

</xml_diff>

<commit_message>
CV: dates on their own line, plainer project headers, one-line bullets
From the CV checker's second round:
- Jobs and projects put their dates on a line of their own under the
  employer or role; education and certificates keep "School | years".
- Project headers read "Role (context)" instead of running role,
  ownership, team status and dates together.
- The procurement-platform bullet now has a measurable outcome: shipped
  with 566 Vitest tests (the verified count from the case study).

To keep one page: the six experience bullets were tightened to one line
each with every figure unchanged (the site's Experience section uses the
same text), page margins top and bottom 10mm -> 8mm, line height 1.15 ->
1.12. PDF and Word (checked in LibreOffice) are both one page.

Co-Authored-By: Claude Opus 5.5 <noreply@anthropic.com>
</commit_message>
<xml_diff>
--- a/public/Montaser-Ismail-CV.docx
+++ b/public/Montaser-Ismail-CV.docx
@@ -57,7 +57,7 @@
         </w:rPr>
         <w:t xml:space="preserve"> | </w:t>
       </w:r>
-      <w:hyperlink w:history="1" r:id="rId09cyhntywfoxqdu__vpwm">
+      <w:hyperlink w:history="1" r:id="rIdjhirgcxnerayevmu6pc6s">
         <w:r>
           <w:rPr>
             <w:rFonts w:ascii="Arial" w:cs="Arial" w:eastAsia="Arial" w:hAnsi="Arial"/>
@@ -77,7 +77,7 @@
         </w:rPr>
         <w:t xml:space="preserve"> | </w:t>
       </w:r>
-      <w:hyperlink w:history="1" r:id="rIdngpw77mssinetlcjzji0_">
+      <w:hyperlink w:history="1" r:id="rIdk2hzyh5ucvmjd-g3dppjo">
         <w:r>
           <w:rPr>
             <w:rFonts w:ascii="Arial" w:cs="Arial" w:eastAsia="Arial" w:hAnsi="Arial"/>
@@ -93,7 +93,7 @@
       <w:pPr>
         <w:jc w:val="center"/>
       </w:pPr>
-      <w:hyperlink w:history="1" r:id="rId5aaobz5ye-gj69h8zt81j">
+      <w:hyperlink w:history="1" r:id="rIdj35blth-kgmnhsd1u2nxc">
         <w:r>
           <w:rPr>
             <w:rFonts w:ascii="Arial" w:cs="Arial" w:eastAsia="Arial" w:hAnsi="Arial"/>
@@ -113,7 +113,7 @@
         </w:rPr>
         <w:t xml:space="preserve"> | </w:t>
       </w:r>
-      <w:hyperlink w:history="1" r:id="rIddklboarxfpzrgk_ssbbys">
+      <w:hyperlink w:history="1" r:id="rId0y5wlwlpodagrkgs0g9oi">
         <w:r>
           <w:rPr>
             <w:rFonts w:ascii="Arial" w:cs="Arial" w:eastAsia="Arial" w:hAnsi="Arial"/>
@@ -133,7 +133,7 @@
         </w:rPr>
         <w:t xml:space="preserve"> | </w:t>
       </w:r>
-      <w:hyperlink w:history="1" r:id="rIdlhiqsj1dv6utzof-cpkx7">
+      <w:hyperlink w:history="1" r:id="rIdcqchwbxnwv4hyydpri3vt">
         <w:r>
           <w:rPr>
             <w:rFonts w:ascii="Arial" w:cs="Arial" w:eastAsia="Arial" w:hAnsi="Arial"/>
@@ -376,7 +376,21 @@
           <w:sz w:val="20"/>
           <w:szCs w:val="20"/>
         </w:rPr>
-        <w:t xml:space="preserve">Arkaan International Group Co. | Full-time | Dec 2025 - Present</w:t>
+        <w:t xml:space="preserve">Arkaan International Group Co. | Full-time</w:t>
+      </w:r>
+    </w:p>
+    <w:p>
+      <w:pPr>
+        <w:keepNext/>
+      </w:pPr>
+      <w:r>
+        <w:rPr>
+          <w:rFonts w:ascii="Arial" w:cs="Arial" w:eastAsia="Arial" w:hAnsi="Arial"/>
+          <w:color w:val="3F4552"/>
+          <w:sz w:val="20"/>
+          <w:szCs w:val="20"/>
+        </w:rPr>
+        <w:t xml:space="preserve">Dec 2025 - Present</w:t>
       </w:r>
     </w:p>
     <w:p>
@@ -390,7 +404,7 @@
           <w:sz w:val="20"/>
           <w:szCs w:val="20"/>
         </w:rPr>
-        <w:t xml:space="preserve">•  Engineered dynamic UI components rendered entirely from JSON metadata schemas, reducing manual frontend coding effort by ~40%.</w:t>
+        <w:t xml:space="preserve">•  Engineered UI components rendered from JSON metadata schemas, cutting manual frontend coding by ~40%.</w:t>
       </w:r>
     </w:p>
     <w:p>
@@ -404,7 +418,7 @@
           <w:sz w:val="20"/>
           <w:szCs w:val="20"/>
         </w:rPr>
-        <w:t xml:space="preserve">•  Developed configurable form builders that auto-generate layouts from backend data models, cutting form development time by ~70% across 5+ form types.</w:t>
+        <w:t xml:space="preserve">•  Built form builders that generate layouts from data models, cutting build time by ~70% on 5+ form types.</w:t>
       </w:r>
     </w:p>
     <w:p>
@@ -418,7 +432,7 @@
           <w:sz w:val="20"/>
           <w:szCs w:val="20"/>
         </w:rPr>
-        <w:t xml:space="preserve">•  Built a high-performance rendering engine mapping server-side metadata to reusable React components, supporting 10+ reusable component types application-wide.</w:t>
+        <w:t xml:space="preserve">•  Built a rendering engine mapping server-side metadata to 10+ reusable React component types.</w:t>
       </w:r>
     </w:p>
     <w:p>
@@ -432,7 +446,7 @@
           <w:sz w:val="20"/>
           <w:szCs w:val="20"/>
         </w:rPr>
-        <w:t xml:space="preserve">•  Led the front end of a client procurement platform and designed its interface in Figma.</w:t>
+        <w:t xml:space="preserve">•  Led the front end of a client procurement platform, designed in Figma and shipped with 566 Vitest tests.</w:t>
       </w:r>
     </w:p>
     <w:p>
@@ -463,7 +477,21 @@
           <w:sz w:val="20"/>
           <w:szCs w:val="20"/>
         </w:rPr>
-        <w:t xml:space="preserve">Qyser Tech. | Part-time, concurrent, Remote | Sep 2024 - Mar 2026</w:t>
+        <w:t xml:space="preserve">Qyser Tech. | Part-time, concurrent, Remote</w:t>
+      </w:r>
+    </w:p>
+    <w:p>
+      <w:pPr>
+        <w:keepNext/>
+      </w:pPr>
+      <w:r>
+        <w:rPr>
+          <w:rFonts w:ascii="Arial" w:cs="Arial" w:eastAsia="Arial" w:hAnsi="Arial"/>
+          <w:color w:val="3F4552"/>
+          <w:sz w:val="20"/>
+          <w:szCs w:val="20"/>
+        </w:rPr>
+        <w:t xml:space="preserve">Sep 2024 - Mar 2026</w:t>
       </w:r>
     </w:p>
     <w:p>
@@ -491,7 +519,7 @@
           <w:sz w:val="20"/>
           <w:szCs w:val="20"/>
         </w:rPr>
-        <w:t xml:space="preserve">•  Built dynamic report generation features with complex queries and aggregations, processing across 100K+ records.</w:t>
+        <w:t xml:space="preserve">•  Built dynamic report generation with complex queries and aggregations over 100K+ records.</w:t>
       </w:r>
     </w:p>
     <w:p>
@@ -505,7 +533,7 @@
           <w:sz w:val="20"/>
           <w:szCs w:val="20"/>
         </w:rPr>
-        <w:t xml:space="preserve">•  Delivered the "Performance" feature using MongoDB aggregations to generate employee insights and support admin approvals, cutting manual HR reporting time by ~60%.</w:t>
+        <w:t xml:space="preserve">•  Delivered "Performance" insights and approvals via MongoDB aggregations, cutting HR reporting time by ~60%.</w:t>
       </w:r>
     </w:p>
     <w:p>
@@ -565,7 +593,21 @@
           <w:sz w:val="20"/>
           <w:szCs w:val="20"/>
         </w:rPr>
-        <w:t xml:space="preserve">Full-stack engineer, API lead - Team project | Oct 2025 - Nov 2025</w:t>
+        <w:t xml:space="preserve">Full-stack engineer, API lead (Team project)</w:t>
+      </w:r>
+    </w:p>
+    <w:p>
+      <w:pPr>
+        <w:keepNext/>
+      </w:pPr>
+      <w:r>
+        <w:rPr>
+          <w:rFonts w:ascii="Arial" w:cs="Arial" w:eastAsia="Arial" w:hAnsi="Arial"/>
+          <w:color w:val="3F4552"/>
+          <w:sz w:val="20"/>
+          <w:szCs w:val="20"/>
+        </w:rPr>
+        <w:t xml:space="preserve">Oct 2025 - Nov 2025</w:t>
       </w:r>
     </w:p>
     <w:p>
@@ -644,7 +686,21 @@
           <w:sz w:val="20"/>
           <w:szCs w:val="20"/>
         </w:rPr>
-        <w:t xml:space="preserve">Full-stack engineer - Own product, live | Sep 2026 - Present</w:t>
+        <w:t xml:space="preserve">Full-stack engineer (Own product, live)</w:t>
+      </w:r>
+    </w:p>
+    <w:p>
+      <w:pPr>
+        <w:keepNext/>
+      </w:pPr>
+      <w:r>
+        <w:rPr>
+          <w:rFonts w:ascii="Arial" w:cs="Arial" w:eastAsia="Arial" w:hAnsi="Arial"/>
+          <w:color w:val="3F4552"/>
+          <w:sz w:val="20"/>
+          <w:szCs w:val="20"/>
+        </w:rPr>
+        <w:t xml:space="preserve">Sep 2026 - Present</w:t>
       </w:r>
     </w:p>
     <w:p>
@@ -723,7 +779,21 @@
           <w:sz w:val="20"/>
           <w:szCs w:val="20"/>
         </w:rPr>
-        <w:t xml:space="preserve">Backend developer - Delivery Quote Ltd, freelance, team project | Dec 2025 - Feb 2026</w:t>
+        <w:t xml:space="preserve">Backend developer (Delivery Quote Ltd, freelance, team project)</w:t>
+      </w:r>
+    </w:p>
+    <w:p>
+      <w:pPr>
+        <w:keepNext/>
+      </w:pPr>
+      <w:r>
+        <w:rPr>
+          <w:rFonts w:ascii="Arial" w:cs="Arial" w:eastAsia="Arial" w:hAnsi="Arial"/>
+          <w:color w:val="3F4552"/>
+          <w:sz w:val="20"/>
+          <w:szCs w:val="20"/>
+        </w:rPr>
+        <w:t xml:space="preserve">Dec 2025 - Feb 2026</w:t>
       </w:r>
     </w:p>
     <w:p>
@@ -869,7 +939,7 @@
     </w:p>
     <w:sectPr>
       <w:pgSz w:w="11905" w:h="16837" w:orient="portrait"/>
-      <w:pgMar w:top="566" w:right="850" w:bottom="566" w:left="850" w:header="708" w:footer="708" w:gutter="0"/>
+      <w:pgMar w:top="453" w:right="850" w:bottom="453" w:left="850" w:header="708" w:footer="708" w:gutter="0"/>
       <w:pgNumType/>
       <w:docGrid w:linePitch="360"/>
     </w:sectPr>

</xml_diff>

<commit_message>
CV: each project links to its proof, a live app or public code
Answers the checker's "Signoff is described as live but has no public
URL": a project shows "Live:" with its live app when it has one,
otherwise "Code:" with its public GitHub repo, on a line of its own and
clickable in both files. Signoff -> content-management-system-iota
.vercel.app (answers 200), SmartShift -> github.com/montaser-hub/Portal;
Trigo is private and gets none. Still one page (PDF, and Word in
LibreOffice).

Co-Authored-By: Claude Opus 5.5 <noreply@anthropic.com>
</commit_message>
<xml_diff>
--- a/public/Montaser-Ismail-CV.docx
+++ b/public/Montaser-Ismail-CV.docx
@@ -57,7 +57,7 @@
         </w:rPr>
         <w:t xml:space="preserve"> | </w:t>
       </w:r>
-      <w:hyperlink w:history="1" r:id="rIdjhirgcxnerayevmu6pc6s">
+      <w:hyperlink w:history="1" r:id="rId-rxwlwv41qlybsbr-t_12">
         <w:r>
           <w:rPr>
             <w:rFonts w:ascii="Arial" w:cs="Arial" w:eastAsia="Arial" w:hAnsi="Arial"/>
@@ -77,7 +77,7 @@
         </w:rPr>
         <w:t xml:space="preserve"> | </w:t>
       </w:r>
-      <w:hyperlink w:history="1" r:id="rIdk2hzyh5ucvmjd-g3dppjo">
+      <w:hyperlink w:history="1" r:id="rIdid33v8d3zj-bkt4pd1qxo">
         <w:r>
           <w:rPr>
             <w:rFonts w:ascii="Arial" w:cs="Arial" w:eastAsia="Arial" w:hAnsi="Arial"/>
@@ -93,7 +93,7 @@
       <w:pPr>
         <w:jc w:val="center"/>
       </w:pPr>
-      <w:hyperlink w:history="1" r:id="rIdj35blth-kgmnhsd1u2nxc">
+      <w:hyperlink w:history="1" r:id="rIdijqcvqzts7_rolqraanyv">
         <w:r>
           <w:rPr>
             <w:rFonts w:ascii="Arial" w:cs="Arial" w:eastAsia="Arial" w:hAnsi="Arial"/>
@@ -113,7 +113,7 @@
         </w:rPr>
         <w:t xml:space="preserve"> | </w:t>
       </w:r>
-      <w:hyperlink w:history="1" r:id="rId0y5wlwlpodagrkgs0g9oi">
+      <w:hyperlink w:history="1" r:id="rIdlczj-uenpu0jezedvugmc">
         <w:r>
           <w:rPr>
             <w:rFonts w:ascii="Arial" w:cs="Arial" w:eastAsia="Arial" w:hAnsi="Arial"/>
@@ -133,7 +133,7 @@
         </w:rPr>
         <w:t xml:space="preserve"> | </w:t>
       </w:r>
-      <w:hyperlink w:history="1" r:id="rIdcqchwbxnwv4hyydpri3vt">
+      <w:hyperlink w:history="1" r:id="rIdou4o6vankldb6ve0gian5">
         <w:r>
           <w:rPr>
             <w:rFonts w:ascii="Arial" w:cs="Arial" w:eastAsia="Arial" w:hAnsi="Arial"/>
@@ -612,6 +612,31 @@
     </w:p>
     <w:p>
       <w:pPr>
+        <w:keepNext/>
+      </w:pPr>
+      <w:r>
+        <w:rPr>
+          <w:rFonts w:ascii="Arial" w:cs="Arial" w:eastAsia="Arial" w:hAnsi="Arial"/>
+          <w:color w:val="3F4552"/>
+          <w:sz w:val="20"/>
+          <w:szCs w:val="20"/>
+        </w:rPr>
+        <w:t xml:space="preserve">Code: </w:t>
+      </w:r>
+      <w:hyperlink w:history="1" r:id="rIdexevnwqbgaplnyyslg0l6">
+        <w:r>
+          <w:rPr>
+            <w:rFonts w:ascii="Arial" w:cs="Arial" w:eastAsia="Arial" w:hAnsi="Arial"/>
+            <w:color w:val="0B4FB3"/>
+            <w:sz w:val="20"/>
+            <w:szCs w:val="20"/>
+          </w:rPr>
+          <w:t xml:space="preserve">github.com/montaser-hub/Portal</w:t>
+        </w:r>
+      </w:hyperlink>
+    </w:p>
+    <w:p>
+      <w:pPr>
         <w:ind w:left="180" w:hanging="180"/>
       </w:pPr>
       <w:r>
@@ -702,6 +727,31 @@
         </w:rPr>
         <w:t xml:space="preserve">Sep 2026 - Present</w:t>
       </w:r>
+    </w:p>
+    <w:p>
+      <w:pPr>
+        <w:keepNext/>
+      </w:pPr>
+      <w:r>
+        <w:rPr>
+          <w:rFonts w:ascii="Arial" w:cs="Arial" w:eastAsia="Arial" w:hAnsi="Arial"/>
+          <w:color w:val="3F4552"/>
+          <w:sz w:val="20"/>
+          <w:szCs w:val="20"/>
+        </w:rPr>
+        <w:t xml:space="preserve">Live: </w:t>
+      </w:r>
+      <w:hyperlink w:history="1" r:id="rIdnbo-7rtoe9sol2mltpihl">
+        <w:r>
+          <w:rPr>
+            <w:rFonts w:ascii="Arial" w:cs="Arial" w:eastAsia="Arial" w:hAnsi="Arial"/>
+            <w:color w:val="0B4FB3"/>
+            <w:sz w:val="20"/>
+            <w:szCs w:val="20"/>
+          </w:rPr>
+          <w:t xml:space="preserve">content-management-system-iota.vercel.app</w:t>
+        </w:r>
+      </w:hyperlink>
     </w:p>
     <w:p>
       <w:pPr>

</xml_diff>